<commit_message>
Parcial I y Recuperación
</commit_message>
<xml_diff>
--- a/Corte1/ParcialAlgoritmos/prueba_corte1 (2)/prueba_corte1/prueba_corte1/Cuadernillo_Estudiante_Prueba_Corte1.docx
+++ b/Corte1/ParcialAlgoritmos/prueba_corte1 (2)/prueba_corte1/prueba_corte1/Cuadernillo_Estudiante_Prueba_Corte1.docx
@@ -1,6 +1,6 @@
 
 <file path=word/document.xml><?xml version="1.0" encoding="utf-8"?>
-<w:document xmlns:wpc="http://schemas.microsoft.com/office/word/2010/wordprocessingCanvas" xmlns:cx="http://schemas.microsoft.com/office/drawing/2014/chartex" xmlns:cx1="http://schemas.microsoft.com/office/drawing/2015/9/8/chartex" xmlns:cx2="http://schemas.microsoft.com/office/drawing/2015/10/21/chartex" xmlns:cx3="http://schemas.microsoft.com/office/drawing/2016/5/9/chartex" xmlns:cx4="http://schemas.microsoft.com/office/drawing/2016/5/10/chartex" xmlns:cx5="http://schemas.microsoft.com/office/drawing/2016/5/11/chartex" xmlns:cx6="http://schemas.microsoft.com/office/drawing/2016/5/12/chartex" xmlns:cx7="http://schemas.microsoft.com/office/drawing/2016/5/13/chartex" xmlns:cx8="http://schemas.microsoft.com/office/drawing/2016/5/14/chartex" xmlns:mc="http://schemas.openxmlformats.org/markup-compatibility/2006" xmlns:aink="http://schemas.microsoft.com/office/drawing/2016/ink" xmlns:am3d="http://schemas.microsoft.com/office/drawing/2017/model3d" xmlns:o="urn:schemas-microsoft-com:office:office" xmlns:oel="http://schemas.microsoft.com/office/2019/extlst" xmlns:r="http://schemas.openxmlformats.org/officeDocument/2006/relationships" xmlns:m="http://schemas.openxmlformats.org/officeDocument/2006/math" xmlns:v="urn:schemas-microsoft-com:vml" xmlns:wp14="http://schemas.microsoft.com/office/word/2010/wordprocessingDrawing" xmlns:wp="http://schemas.openxmlformats.org/drawingml/2006/wordprocessingDrawing" xmlns:w10="urn:schemas-microsoft-com:office:word" xmlns:w="http://schemas.openxmlformats.org/wordprocessingml/2006/main" xmlns:w14="http://schemas.microsoft.com/office/word/2010/wordml" xmlns:w15="http://schemas.microsoft.com/office/word/2012/wordml" xmlns:w16cex="http://schemas.microsoft.com/office/word/2018/wordml/cex" xmlns:w16cid="http://schemas.microsoft.com/office/word/2016/wordml/cid" xmlns:w16="http://schemas.microsoft.com/office/word/2018/wordml" xmlns:w16du="http://schemas.microsoft.com/office/word/2023/wordml/word16du" xmlns:w16sdtdh="http://schemas.microsoft.com/office/word/2020/wordml/sdtdatahash" xmlns:w16sdtfl="http://schemas.microsoft.com/office/word/2024/wordml/sdtformatlock" xmlns:w16se="http://schemas.microsoft.com/office/word/2015/wordml/symex" xmlns:wpg="http://schemas.microsoft.com/office/word/2010/wordprocessingGroup" xmlns:wpi="http://schemas.microsoft.com/office/word/2010/wordprocessingInk" xmlns:wne="http://schemas.microsoft.com/office/word/2006/wordml" xmlns:wps="http://schemas.microsoft.com/office/word/2010/wordprocessingShape" mc:Ignorable="w14 w15 w16se w16cid w16 w16cex w16sdtdh w16sdtfl w16du wp14">
+<w:document xmlns:wpc="http://schemas.microsoft.com/office/word/2010/wordprocessingCanvas" xmlns:cx="http://schemas.microsoft.com/office/drawing/2014/chartex" xmlns:cx1="http://schemas.microsoft.com/office/drawing/2015/9/8/chartex" xmlns:cx2="http://schemas.microsoft.com/office/drawing/2015/10/21/chartex" xmlns:cx3="http://schemas.microsoft.com/office/drawing/2016/5/9/chartex" xmlns:cx4="http://schemas.microsoft.com/office/drawing/2016/5/10/chartex" xmlns:cx5="http://schemas.microsoft.com/office/drawing/2016/5/11/chartex" xmlns:cx6="http://schemas.microsoft.com/office/drawing/2016/5/12/chartex" xmlns:cx7="http://schemas.microsoft.com/office/drawing/2016/5/13/chartex" xmlns:cx8="http://schemas.microsoft.com/office/drawing/2016/5/14/chartex" xmlns:mc="http://schemas.openxmlformats.org/markup-compatibility/2006" xmlns:aink="http://schemas.microsoft.com/office/drawing/2016/ink" xmlns:am3d="http://schemas.microsoft.com/office/drawing/2017/model3d" xmlns:o="urn:schemas-microsoft-com:office:office" xmlns:oel="http://schemas.microsoft.com/office/2019/extlst" xmlns:r="http://schemas.openxmlformats.org/officeDocument/2006/relationships" xmlns:m="http://schemas.openxmlformats.org/officeDocument/2006/math" xmlns:v="urn:schemas-microsoft-com:vml" xmlns:wp14="http://schemas.microsoft.com/office/word/2010/wordprocessingDrawing" xmlns:wp="http://schemas.openxmlformats.org/drawingml/2006/wordprocessingDrawing" xmlns:w10="urn:schemas-microsoft-com:office:word" xmlns:w="http://schemas.openxmlformats.org/wordprocessingml/2006/main" xmlns:w14="http://schemas.microsoft.com/office/word/2010/wordml" xmlns:w15="http://schemas.microsoft.com/office/word/2012/wordml" xmlns:w16cex="http://schemas.microsoft.com/office/word/2018/wordml/cex" xmlns:w16cid="http://schemas.microsoft.com/office/word/2016/wordml/cid" xmlns:w16="http://schemas.microsoft.com/office/word/2018/wordml" xmlns:w16sdtdh="http://schemas.microsoft.com/office/word/2020/wordml/sdtdatahash" xmlns:w16se="http://schemas.microsoft.com/office/word/2015/wordml/symex" xmlns:wpg="http://schemas.microsoft.com/office/word/2010/wordprocessingGroup" xmlns:wpi="http://schemas.microsoft.com/office/word/2010/wordprocessingInk" xmlns:wne="http://schemas.microsoft.com/office/word/2006/wordml" xmlns:wps="http://schemas.microsoft.com/office/word/2010/wordprocessingShape" mc:Ignorable="w14 w15 w16se w16cid w16 w16cex w16sdtdh wp14">
   <w:body>
     <w:p>
       <w:pPr>
@@ -29,7 +29,25 @@
           <w:sz w:val="19"/>
           <w:szCs w:val="19"/>
         </w:rPr>
-        <w:t>Sistema de gestión de incidencias  ·  Turno de guardia</w:t>
+        <w:t xml:space="preserve">Sistema de gestión de </w:t>
+      </w:r>
+      <w:proofErr w:type="gramStart"/>
+      <w:r>
+        <w:rPr>
+          <w:color w:val="555555"/>
+          <w:sz w:val="19"/>
+          <w:szCs w:val="19"/>
+        </w:rPr>
+        <w:t>incidencias  ·</w:t>
+      </w:r>
+      <w:proofErr w:type="gramEnd"/>
+      <w:r>
+        <w:rPr>
+          <w:color w:val="555555"/>
+          <w:sz w:val="19"/>
+          <w:szCs w:val="19"/>
+        </w:rPr>
+        <w:t xml:space="preserve">  Turno de guardia</w:t>
       </w:r>
     </w:p>
     <w:p>
@@ -57,7 +75,21 @@
         <w:rPr>
           <w:color w:val="B08A2E"/>
         </w:rPr>
-        <w:t>Prueba práctica del Corte 1  ·  Algoritmos y estructura de datos</w:t>
+        <w:t xml:space="preserve">Prueba práctica del Corte </w:t>
+      </w:r>
+      <w:proofErr w:type="gramStart"/>
+      <w:r>
+        <w:rPr>
+          <w:color w:val="B08A2E"/>
+        </w:rPr>
+        <w:t>1  ·</w:t>
+      </w:r>
+      <w:proofErr w:type="gramEnd"/>
+      <w:r>
+        <w:rPr>
+          <w:color w:val="B08A2E"/>
+        </w:rPr>
+        <w:t xml:space="preserve">  Algoritmos y estructura de datos</w:t>
       </w:r>
     </w:p>
     <w:tbl>
@@ -84,12 +116,6 @@
         <w:gridCol w:w="2600"/>
       </w:tblGrid>
       <w:tr>
-        <w:tblPrEx>
-          <w:tblCellMar>
-            <w:top w:w="0" w:type="dxa"/>
-            <w:bottom w:w="0" w:type="dxa"/>
-          </w:tblCellMar>
-        </w:tblPrEx>
         <w:tc>
           <w:tcPr>
             <w:tcW w:w="2100" w:type="dxa"/>
@@ -180,6 +206,28 @@
     <w:p>
       <w:pPr>
         <w:spacing w:after="120"/>
+        <w:rPr>
+          <w:b/>
+          <w:bCs/>
+          <w:color w:val="000000"/>
+          <w:sz w:val="24"/>
+          <w:szCs w:val="24"/>
+        </w:rPr>
+      </w:pPr>
+      <w:r>
+        <w:rPr>
+          <w:b/>
+          <w:bCs/>
+          <w:color w:val="000000"/>
+          <w:sz w:val="24"/>
+          <w:szCs w:val="24"/>
+        </w:rPr>
+        <w:t>Revisar puntos 1, 2 y 5.</w:t>
+      </w:r>
+    </w:p>
+    <w:p>
+      <w:pPr>
+        <w:spacing w:after="120"/>
       </w:pPr>
       <w:r>
         <w:rPr>
@@ -350,14 +398,33 @@
           <w:sz w:val="18"/>
           <w:szCs w:val="18"/>
         </w:rPr>
-        <w:t xml:space="preserve">SOBRE EL CÓDIGO DE CIERRE  </w:t>
-      </w:r>
-      <w:r>
-        <w:rPr>
-          <w:sz w:val="19"/>
-          <w:szCs w:val="19"/>
-        </w:rPr>
-        <w:t>No está escrito en ningún archivo: se calcula a partir de los resultados correctos. No se puede adivinar, ni leer del archivo de pruebas, ni copiar del compañero, porque un resultado equivocado produce un código distinto.</w:t>
+        <w:t xml:space="preserve">SOBRE EL CÓDIGO DE </w:t>
+      </w:r>
+      <w:proofErr w:type="gramStart"/>
+      <w:r>
+        <w:rPr>
+          <w:b/>
+          <w:bCs/>
+          <w:color w:val="8A5200"/>
+          <w:sz w:val="18"/>
+          <w:szCs w:val="18"/>
+        </w:rPr>
+        <w:t xml:space="preserve">CIERRE  </w:t>
+      </w:r>
+      <w:r>
+        <w:rPr>
+          <w:sz w:val="19"/>
+          <w:szCs w:val="19"/>
+        </w:rPr>
+        <w:t>No</w:t>
+      </w:r>
+      <w:proofErr w:type="gramEnd"/>
+      <w:r>
+        <w:rPr>
+          <w:sz w:val="19"/>
+          <w:szCs w:val="19"/>
+        </w:rPr>
+        <w:t xml:space="preserve"> está escrito en ningún archivo: se calcula a partir de los resultados correctos. No se puede adivinar, ni leer del archivo de pruebas, ni copiar del compañero, porque un resultado equivocado produce un código distinto.</w:t>
       </w:r>
     </w:p>
     <w:p>
@@ -656,7 +723,25 @@
           <w:sz w:val="15"/>
           <w:szCs w:val="15"/>
         </w:rPr>
-        <w:t xml:space="preserve">  [OK ] </w:t>
+        <w:t xml:space="preserve">  [</w:t>
+      </w:r>
+      <w:proofErr w:type="gramStart"/>
+      <w:r>
+        <w:rPr>
+          <w:rFonts w:ascii="Consolas" w:eastAsia="Consolas" w:hAnsi="Consolas" w:cs="Consolas"/>
+          <w:sz w:val="15"/>
+          <w:szCs w:val="15"/>
+        </w:rPr>
+        <w:t>OK ]</w:t>
+      </w:r>
+      <w:proofErr w:type="gramEnd"/>
+      <w:r>
+        <w:rPr>
+          <w:rFonts w:ascii="Consolas" w:eastAsia="Consolas" w:hAnsi="Consolas" w:cs="Consolas"/>
+          <w:sz w:val="15"/>
+          <w:szCs w:val="15"/>
+        </w:rPr>
+        <w:t xml:space="preserve"> </w:t>
       </w:r>
       <w:proofErr w:type="spellStart"/>
       <w:r>
@@ -691,7 +776,25 @@
           <w:sz w:val="15"/>
           <w:szCs w:val="15"/>
         </w:rPr>
-        <w:t xml:space="preserve">  [OK ] </w:t>
+        <w:t xml:space="preserve">  [</w:t>
+      </w:r>
+      <w:proofErr w:type="gramStart"/>
+      <w:r>
+        <w:rPr>
+          <w:rFonts w:ascii="Consolas" w:eastAsia="Consolas" w:hAnsi="Consolas" w:cs="Consolas"/>
+          <w:sz w:val="15"/>
+          <w:szCs w:val="15"/>
+        </w:rPr>
+        <w:t>OK ]</w:t>
+      </w:r>
+      <w:proofErr w:type="gramEnd"/>
+      <w:r>
+        <w:rPr>
+          <w:rFonts w:ascii="Consolas" w:eastAsia="Consolas" w:hAnsi="Consolas" w:cs="Consolas"/>
+          <w:sz w:val="15"/>
+          <w:szCs w:val="15"/>
+        </w:rPr>
+        <w:t xml:space="preserve"> </w:t>
       </w:r>
       <w:proofErr w:type="spellStart"/>
       <w:r>
@@ -935,12 +1038,6 @@
         <w:gridCol w:w="6000"/>
       </w:tblGrid>
       <w:tr>
-        <w:tblPrEx>
-          <w:tblCellMar>
-            <w:top w:w="0" w:type="dxa"/>
-            <w:bottom w:w="0" w:type="dxa"/>
-          </w:tblCellMar>
-        </w:tblPrEx>
         <w:trPr>
           <w:tblHeader/>
         </w:trPr>
@@ -1030,12 +1127,6 @@
         </w:tc>
       </w:tr>
       <w:tr>
-        <w:tblPrEx>
-          <w:tblCellMar>
-            <w:top w:w="0" w:type="dxa"/>
-            <w:bottom w:w="0" w:type="dxa"/>
-          </w:tblCellMar>
-        </w:tblPrEx>
         <w:tc>
           <w:tcPr>
             <w:tcW w:w="1300" w:type="dxa"/>
@@ -1104,12 +1195,6 @@
         </w:tc>
       </w:tr>
       <w:tr>
-        <w:tblPrEx>
-          <w:tblCellMar>
-            <w:top w:w="0" w:type="dxa"/>
-            <w:bottom w:w="0" w:type="dxa"/>
-          </w:tblCellMar>
-        </w:tblPrEx>
         <w:tc>
           <w:tcPr>
             <w:tcW w:w="1300" w:type="dxa"/>
@@ -1181,12 +1266,6 @@
         </w:tc>
       </w:tr>
       <w:tr>
-        <w:tblPrEx>
-          <w:tblCellMar>
-            <w:top w:w="0" w:type="dxa"/>
-            <w:bottom w:w="0" w:type="dxa"/>
-          </w:tblCellMar>
-        </w:tblPrEx>
         <w:tc>
           <w:tcPr>
             <w:tcW w:w="1300" w:type="dxa"/>
@@ -1321,18 +1400,30 @@
                 <w:sz w:val="18"/>
                 <w:szCs w:val="18"/>
               </w:rPr>
-              <w:t xml:space="preserve"> -g -o inventario inventario.cpp ./inventario</w:t>
+              <w:t xml:space="preserve"> -g -o inventario </w:t>
+            </w:r>
+            <w:proofErr w:type="gramStart"/>
+            <w:r>
+              <w:rPr>
+                <w:color w:val="000000"/>
+                <w:sz w:val="18"/>
+                <w:szCs w:val="18"/>
+              </w:rPr>
+              <w:t>inventario.cpp .</w:t>
+            </w:r>
+            <w:proofErr w:type="gramEnd"/>
+            <w:r>
+              <w:rPr>
+                <w:color w:val="000000"/>
+                <w:sz w:val="18"/>
+                <w:szCs w:val="18"/>
+              </w:rPr>
+              <w:t>/inventario</w:t>
             </w:r>
           </w:p>
         </w:tc>
       </w:tr>
       <w:tr>
-        <w:tblPrEx>
-          <w:tblCellMar>
-            <w:top w:w="0" w:type="dxa"/>
-            <w:bottom w:w="0" w:type="dxa"/>
-          </w:tblCellMar>
-        </w:tblPrEx>
         <w:tc>
           <w:tcPr>
             <w:tcW w:w="1300" w:type="dxa"/>
@@ -1398,7 +1489,25 @@
                 <w:sz w:val="18"/>
                 <w:szCs w:val="18"/>
               </w:rPr>
-              <w:t xml:space="preserve">./pruebas_t4.sh          (o bien:  </w:t>
+              <w:t xml:space="preserve">./pruebas_t4.sh       </w:t>
+            </w:r>
+            <w:proofErr w:type="gramStart"/>
+            <w:r>
+              <w:rPr>
+                <w:color w:val="000000"/>
+                <w:sz w:val="18"/>
+                <w:szCs w:val="18"/>
+              </w:rPr>
+              <w:t xml:space="preserve">   (</w:t>
+            </w:r>
+            <w:proofErr w:type="gramEnd"/>
+            <w:r>
+              <w:rPr>
+                <w:color w:val="000000"/>
+                <w:sz w:val="18"/>
+                <w:szCs w:val="18"/>
+              </w:rPr>
+              <w:t xml:space="preserve">o bien:  </w:t>
             </w:r>
             <w:proofErr w:type="spellStart"/>
             <w:r>
@@ -1422,12 +1531,6 @@
         </w:tc>
       </w:tr>
       <w:tr>
-        <w:tblPrEx>
-          <w:tblCellMar>
-            <w:top w:w="0" w:type="dxa"/>
-            <w:bottom w:w="0" w:type="dxa"/>
-          </w:tblCellMar>
-        </w:tblPrEx>
         <w:tc>
           <w:tcPr>
             <w:tcW w:w="1300" w:type="dxa"/>
@@ -1510,14 +1613,33 @@
           <w:sz w:val="18"/>
           <w:szCs w:val="18"/>
         </w:rPr>
-        <w:t xml:space="preserve">REGLA QUE NO TIENE EXCEPCIÓN  </w:t>
-      </w:r>
-      <w:r>
-        <w:rPr>
-          <w:sz w:val="19"/>
-          <w:szCs w:val="19"/>
-        </w:rPr>
-        <w:t>Los archivos cuyo nombre empieza por «pruebas» NO se modifican. Están ahí para que usted se verifique solo. Alterarlos para que impriman el código es fraude y aplica el protocolo del reglamento (sección 13 de la guía).</w:t>
+        <w:t xml:space="preserve">REGLA QUE NO TIENE </w:t>
+      </w:r>
+      <w:proofErr w:type="gramStart"/>
+      <w:r>
+        <w:rPr>
+          <w:b/>
+          <w:bCs/>
+          <w:color w:val="8A0000"/>
+          <w:sz w:val="18"/>
+          <w:szCs w:val="18"/>
+        </w:rPr>
+        <w:t xml:space="preserve">EXCEPCIÓN  </w:t>
+      </w:r>
+      <w:r>
+        <w:rPr>
+          <w:sz w:val="19"/>
+          <w:szCs w:val="19"/>
+        </w:rPr>
+        <w:t>Los</w:t>
+      </w:r>
+      <w:proofErr w:type="gramEnd"/>
+      <w:r>
+        <w:rPr>
+          <w:sz w:val="19"/>
+          <w:szCs w:val="19"/>
+        </w:rPr>
+        <w:t xml:space="preserve"> archivos cuyo nombre empieza por «pruebas» NO se modifican. Están ahí para que usted se verifique solo. Alterarlos para que impriman el código es fraude y aplica el protocolo del reglamento (sección 13 de la guía).</w:t>
       </w:r>
     </w:p>
     <w:p>
@@ -1589,12 +1711,6 @@
         <w:gridCol w:w="3000"/>
       </w:tblGrid>
       <w:tr>
-        <w:tblPrEx>
-          <w:tblCellMar>
-            <w:top w:w="0" w:type="dxa"/>
-            <w:bottom w:w="0" w:type="dxa"/>
-          </w:tblCellMar>
-        </w:tblPrEx>
         <w:trPr>
           <w:tblHeader/>
         </w:trPr>
@@ -1740,12 +1856,6 @@
         </w:tc>
       </w:tr>
       <w:tr>
-        <w:tblPrEx>
-          <w:tblCellMar>
-            <w:top w:w="0" w:type="dxa"/>
-            <w:bottom w:w="0" w:type="dxa"/>
-          </w:tblCellMar>
-        </w:tblPrEx>
         <w:tc>
           <w:tcPr>
             <w:tcW w:w="1400" w:type="dxa"/>
@@ -1840,12 +1950,6 @@
         </w:tc>
       </w:tr>
       <w:tr>
-        <w:tblPrEx>
-          <w:tblCellMar>
-            <w:top w:w="0" w:type="dxa"/>
-            <w:bottom w:w="0" w:type="dxa"/>
-          </w:tblCellMar>
-        </w:tblPrEx>
         <w:tc>
           <w:tcPr>
             <w:tcW w:w="1400" w:type="dxa"/>
@@ -1928,8 +2032,13 @@
             <w:vAlign w:val="center"/>
           </w:tcPr>
           <w:p>
+            <w:proofErr w:type="gramStart"/>
             <w:r>
-              <w:t>TC(8:56) 0.9</w:t>
+              <w:t>TC(</w:t>
+            </w:r>
+            <w:proofErr w:type="gramEnd"/>
+            <w:r>
+              <w:t>8:56) 0.9</w:t>
             </w:r>
           </w:p>
         </w:tc>
@@ -1953,12 +2062,6 @@
         </w:tc>
       </w:tr>
       <w:tr>
-        <w:tblPrEx>
-          <w:tblCellMar>
-            <w:top w:w="0" w:type="dxa"/>
-            <w:bottom w:w="0" w:type="dxa"/>
-          </w:tblCellMar>
-        </w:tblPrEx>
         <w:tc>
           <w:tcPr>
             <w:tcW w:w="1400" w:type="dxa"/>
@@ -2053,12 +2156,6 @@
         </w:tc>
       </w:tr>
       <w:tr>
-        <w:tblPrEx>
-          <w:tblCellMar>
-            <w:top w:w="0" w:type="dxa"/>
-            <w:bottom w:w="0" w:type="dxa"/>
-          </w:tblCellMar>
-        </w:tblPrEx>
         <w:tc>
           <w:tcPr>
             <w:tcW w:w="1400" w:type="dxa"/>
@@ -2158,12 +2255,6 @@
         </w:tc>
       </w:tr>
       <w:tr>
-        <w:tblPrEx>
-          <w:tblCellMar>
-            <w:top w:w="0" w:type="dxa"/>
-            <w:bottom w:w="0" w:type="dxa"/>
-          </w:tblCellMar>
-        </w:tblPrEx>
         <w:tc>
           <w:tcPr>
             <w:tcW w:w="1400" w:type="dxa"/>
@@ -2690,6 +2781,7 @@
         <w:spacing w:before="120" w:after="130"/>
         <w:ind w:left="130" w:right="130"/>
       </w:pPr>
+      <w:proofErr w:type="gramStart"/>
       <w:r>
         <w:rPr>
           <w:b/>
@@ -2705,7 +2797,15 @@
           <w:sz w:val="19"/>
           <w:szCs w:val="19"/>
         </w:rPr>
-        <w:t>Este es el único ticket que no depende del computador. Si tiene un problema técnico con su equipo, este ticket le garantiza que no sale en cero. Respóndalo completo.</w:t>
+        <w:t>Este</w:t>
+      </w:r>
+      <w:proofErr w:type="gramEnd"/>
+      <w:r>
+        <w:rPr>
+          <w:sz w:val="19"/>
+          <w:szCs w:val="19"/>
+        </w:rPr>
+        <w:t xml:space="preserve"> es el único ticket que no depende del computador. Si tiene un problema técnico con su equipo, este ticket le garantiza que no sale en cero. Respóndalo completo.</w:t>
       </w:r>
     </w:p>
     <w:p>
@@ -2722,7 +2822,29 @@
           <w:sz w:val="16"/>
           <w:szCs w:val="16"/>
         </w:rPr>
-        <w:t>Fragmento 1 · C++  —  ¿qué imprime?</w:t>
+        <w:t xml:space="preserve">Fragmento 1 · </w:t>
+      </w:r>
+      <w:proofErr w:type="gramStart"/>
+      <w:r>
+        <w:rPr>
+          <w:b/>
+          <w:bCs/>
+          <w:color w:val="555555"/>
+          <w:sz w:val="16"/>
+          <w:szCs w:val="16"/>
+        </w:rPr>
+        <w:t>C++  —</w:t>
+      </w:r>
+      <w:proofErr w:type="gramEnd"/>
+      <w:r>
+        <w:rPr>
+          <w:b/>
+          <w:bCs/>
+          <w:color w:val="555555"/>
+          <w:sz w:val="16"/>
+          <w:szCs w:val="16"/>
+        </w:rPr>
+        <w:t xml:space="preserve">  ¿qué imprime?</w:t>
       </w:r>
     </w:p>
     <w:p>
@@ -2749,7 +2871,25 @@
           <w:sz w:val="15"/>
           <w:szCs w:val="15"/>
         </w:rPr>
-        <w:t xml:space="preserve"> v[4] = {5, 3, 9, 1};</w:t>
+        <w:t xml:space="preserve"> </w:t>
+      </w:r>
+      <w:proofErr w:type="gramStart"/>
+      <w:r>
+        <w:rPr>
+          <w:rFonts w:ascii="Consolas" w:eastAsia="Consolas" w:hAnsi="Consolas" w:cs="Consolas"/>
+          <w:sz w:val="15"/>
+          <w:szCs w:val="15"/>
+        </w:rPr>
+        <w:t>v[</w:t>
+      </w:r>
+      <w:proofErr w:type="gramEnd"/>
+      <w:r>
+        <w:rPr>
+          <w:rFonts w:ascii="Consolas" w:eastAsia="Consolas" w:hAnsi="Consolas" w:cs="Consolas"/>
+          <w:sz w:val="15"/>
+          <w:szCs w:val="15"/>
+        </w:rPr>
+        <w:t>4] = {5, 3, 9, 1};</w:t>
       </w:r>
     </w:p>
     <w:p>
@@ -2833,7 +2973,29 @@
           <w:sz w:val="16"/>
           <w:szCs w:val="16"/>
         </w:rPr>
-        <w:t>Fragmento 2 · Python  —  ¿qué imprime?</w:t>
+        <w:t xml:space="preserve">Fragmento 2 · </w:t>
+      </w:r>
+      <w:proofErr w:type="gramStart"/>
+      <w:r>
+        <w:rPr>
+          <w:b/>
+          <w:bCs/>
+          <w:color w:val="555555"/>
+          <w:sz w:val="16"/>
+          <w:szCs w:val="16"/>
+        </w:rPr>
+        <w:t>Python  —</w:t>
+      </w:r>
+      <w:proofErr w:type="gramEnd"/>
+      <w:r>
+        <w:rPr>
+          <w:b/>
+          <w:bCs/>
+          <w:color w:val="555555"/>
+          <w:sz w:val="16"/>
+          <w:szCs w:val="16"/>
+        </w:rPr>
+        <w:t xml:space="preserve">  ¿qué imprime?</w:t>
       </w:r>
     </w:p>
     <w:p>
@@ -2861,13 +3023,23 @@
         <w:spacing w:line="220" w:lineRule="auto"/>
         <w:ind w:left="240"/>
       </w:pPr>
-      <w:r>
-        <w:rPr>
-          <w:rFonts w:ascii="Consolas" w:eastAsia="Consolas" w:hAnsi="Consolas" w:cs="Consolas"/>
-          <w:sz w:val="15"/>
-          <w:szCs w:val="15"/>
-        </w:rPr>
-        <w:t>m[0][0] = 7</w:t>
+      <w:proofErr w:type="gramStart"/>
+      <w:r>
+        <w:rPr>
+          <w:rFonts w:ascii="Consolas" w:eastAsia="Consolas" w:hAnsi="Consolas" w:cs="Consolas"/>
+          <w:sz w:val="15"/>
+          <w:szCs w:val="15"/>
+        </w:rPr>
+        <w:t>m[</w:t>
+      </w:r>
+      <w:proofErr w:type="gramEnd"/>
+      <w:r>
+        <w:rPr>
+          <w:rFonts w:ascii="Consolas" w:eastAsia="Consolas" w:hAnsi="Consolas" w:cs="Consolas"/>
+          <w:sz w:val="15"/>
+          <w:szCs w:val="15"/>
+        </w:rPr>
+        <w:t>0][0] = 7</w:t>
       </w:r>
     </w:p>
     <w:p>
@@ -2921,7 +3093,29 @@
           <w:sz w:val="16"/>
           <w:szCs w:val="16"/>
         </w:rPr>
-        <w:t>Fragmento 3 · Python  —  ¿qué imprime?</w:t>
+        <w:t xml:space="preserve">Fragmento 3 · </w:t>
+      </w:r>
+      <w:proofErr w:type="gramStart"/>
+      <w:r>
+        <w:rPr>
+          <w:b/>
+          <w:bCs/>
+          <w:color w:val="555555"/>
+          <w:sz w:val="16"/>
+          <w:szCs w:val="16"/>
+        </w:rPr>
+        <w:t>Python  —</w:t>
+      </w:r>
+      <w:proofErr w:type="gramEnd"/>
+      <w:r>
+        <w:rPr>
+          <w:b/>
+          <w:bCs/>
+          <w:color w:val="555555"/>
+          <w:sz w:val="16"/>
+          <w:szCs w:val="16"/>
+        </w:rPr>
+        <w:t xml:space="preserve">  ¿qué imprime?</w:t>
       </w:r>
     </w:p>
     <w:p>
@@ -3073,7 +3267,29 @@
           <w:sz w:val="16"/>
           <w:szCs w:val="16"/>
         </w:rPr>
-        <w:t>Fragmento 4 · Python  —  ¿qué imprime?</w:t>
+        <w:t xml:space="preserve">Fragmento 4 · </w:t>
+      </w:r>
+      <w:proofErr w:type="gramStart"/>
+      <w:r>
+        <w:rPr>
+          <w:b/>
+          <w:bCs/>
+          <w:color w:val="555555"/>
+          <w:sz w:val="16"/>
+          <w:szCs w:val="16"/>
+        </w:rPr>
+        <w:t>Python  —</w:t>
+      </w:r>
+      <w:proofErr w:type="gramEnd"/>
+      <w:r>
+        <w:rPr>
+          <w:b/>
+          <w:bCs/>
+          <w:color w:val="555555"/>
+          <w:sz w:val="16"/>
+          <w:szCs w:val="16"/>
+        </w:rPr>
+        <w:t xml:space="preserve">  ¿qué imprime?</w:t>
       </w:r>
     </w:p>
     <w:p>
@@ -3120,6 +3336,7 @@
         <w:t xml:space="preserve">    </w:t>
       </w:r>
       <w:proofErr w:type="spellStart"/>
+      <w:proofErr w:type="gramStart"/>
       <w:r>
         <w:rPr>
           <w:rFonts w:ascii="Consolas" w:eastAsia="Consolas" w:hAnsi="Consolas" w:cs="Consolas"/>
@@ -3129,6 +3346,7 @@
         <w:t>lista.append</w:t>
       </w:r>
       <w:proofErr w:type="spellEnd"/>
+      <w:proofErr w:type="gramEnd"/>
       <w:r>
         <w:rPr>
           <w:rFonts w:ascii="Consolas" w:eastAsia="Consolas" w:hAnsi="Consolas" w:cs="Consolas"/>
@@ -3243,7 +3461,29 @@
           <w:sz w:val="16"/>
           <w:szCs w:val="16"/>
         </w:rPr>
-        <w:t>Fragmento 5 · C++  —  ¿qué imprime?</w:t>
+        <w:t xml:space="preserve">Fragmento 5 · </w:t>
+      </w:r>
+      <w:proofErr w:type="gramStart"/>
+      <w:r>
+        <w:rPr>
+          <w:b/>
+          <w:bCs/>
+          <w:color w:val="555555"/>
+          <w:sz w:val="16"/>
+          <w:szCs w:val="16"/>
+        </w:rPr>
+        <w:t>C++  —</w:t>
+      </w:r>
+      <w:proofErr w:type="gramEnd"/>
+      <w:r>
+        <w:rPr>
+          <w:b/>
+          <w:bCs/>
+          <w:color w:val="555555"/>
+          <w:sz w:val="16"/>
+          <w:szCs w:val="16"/>
+        </w:rPr>
+        <w:t xml:space="preserve">  ¿qué imprime?</w:t>
       </w:r>
     </w:p>
     <w:p>
@@ -3270,7 +3510,16 @@
           <w:sz w:val="15"/>
           <w:szCs w:val="15"/>
         </w:rPr>
-        <w:t xml:space="preserve"> A { </w:t>
+        <w:t xml:space="preserve"> A </w:t>
+      </w:r>
+      <w:proofErr w:type="gramStart"/>
+      <w:r>
+        <w:rPr>
+          <w:rFonts w:ascii="Consolas" w:eastAsia="Consolas" w:hAnsi="Consolas" w:cs="Consolas"/>
+          <w:sz w:val="15"/>
+          <w:szCs w:val="15"/>
+        </w:rPr>
+        <w:t xml:space="preserve">{ </w:t>
       </w:r>
       <w:proofErr w:type="spellStart"/>
       <w:r>
@@ -3282,6 +3531,7 @@
         <w:t>public</w:t>
       </w:r>
       <w:proofErr w:type="spellEnd"/>
+      <w:proofErr w:type="gramEnd"/>
       <w:r>
         <w:rPr>
           <w:rFonts w:ascii="Consolas" w:eastAsia="Consolas" w:hAnsi="Consolas" w:cs="Consolas"/>
@@ -3369,7 +3619,25 @@
           <w:sz w:val="15"/>
           <w:szCs w:val="15"/>
         </w:rPr>
-        <w:t xml:space="preserve"> B : </w:t>
+        <w:t xml:space="preserve"> </w:t>
+      </w:r>
+      <w:proofErr w:type="gramStart"/>
+      <w:r>
+        <w:rPr>
+          <w:rFonts w:ascii="Consolas" w:eastAsia="Consolas" w:hAnsi="Consolas" w:cs="Consolas"/>
+          <w:sz w:val="15"/>
+          <w:szCs w:val="15"/>
+        </w:rPr>
+        <w:t>B :</w:t>
+      </w:r>
+      <w:proofErr w:type="gramEnd"/>
+      <w:r>
+        <w:rPr>
+          <w:rFonts w:ascii="Consolas" w:eastAsia="Consolas" w:hAnsi="Consolas" w:cs="Consolas"/>
+          <w:sz w:val="15"/>
+          <w:szCs w:val="15"/>
+        </w:rPr>
+        <w:t xml:space="preserve"> </w:t>
       </w:r>
       <w:proofErr w:type="spellStart"/>
       <w:r>
@@ -3536,7 +3804,25 @@
           <w:sz w:val="15"/>
           <w:szCs w:val="15"/>
         </w:rPr>
-        <w:t xml:space="preserve"> &lt;&lt; p-&gt;quien();</w:t>
+        <w:t xml:space="preserve"> &lt;&lt; p-&gt;</w:t>
+      </w:r>
+      <w:proofErr w:type="gramStart"/>
+      <w:r>
+        <w:rPr>
+          <w:rFonts w:ascii="Consolas" w:eastAsia="Consolas" w:hAnsi="Consolas" w:cs="Consolas"/>
+          <w:sz w:val="15"/>
+          <w:szCs w:val="15"/>
+        </w:rPr>
+        <w:t>quien(</w:t>
+      </w:r>
+      <w:proofErr w:type="gramEnd"/>
+      <w:r>
+        <w:rPr>
+          <w:rFonts w:ascii="Consolas" w:eastAsia="Consolas" w:hAnsi="Consolas" w:cs="Consolas"/>
+          <w:sz w:val="15"/>
+          <w:szCs w:val="15"/>
+        </w:rPr>
+        <w:t>);</w:t>
       </w:r>
     </w:p>
     <w:p>
@@ -3570,7 +3856,29 @@
           <w:sz w:val="16"/>
           <w:szCs w:val="16"/>
         </w:rPr>
-        <w:t>Fragmento 6 · C++  —  ¿qué está mal?</w:t>
+        <w:t xml:space="preserve">Fragmento 6 · </w:t>
+      </w:r>
+      <w:proofErr w:type="gramStart"/>
+      <w:r>
+        <w:rPr>
+          <w:b/>
+          <w:bCs/>
+          <w:color w:val="555555"/>
+          <w:sz w:val="16"/>
+          <w:szCs w:val="16"/>
+        </w:rPr>
+        <w:t>C++  —</w:t>
+      </w:r>
+      <w:proofErr w:type="gramEnd"/>
+      <w:r>
+        <w:rPr>
+          <w:b/>
+          <w:bCs/>
+          <w:color w:val="555555"/>
+          <w:sz w:val="16"/>
+          <w:szCs w:val="16"/>
+        </w:rPr>
+        <w:t xml:space="preserve">  ¿qué está mal?</w:t>
       </w:r>
     </w:p>
     <w:p>
@@ -3676,9 +3984,19 @@
           <w:sz w:val="15"/>
           <w:szCs w:val="15"/>
         </w:rPr>
-        <w:t xml:space="preserve">    Registro(</w:t>
-      </w:r>
-      <w:proofErr w:type="spellStart"/>
+        <w:t xml:space="preserve">    </w:t>
+      </w:r>
+      <w:proofErr w:type="gramStart"/>
+      <w:r>
+        <w:rPr>
+          <w:rFonts w:ascii="Consolas" w:eastAsia="Consolas" w:hAnsi="Consolas" w:cs="Consolas"/>
+          <w:sz w:val="15"/>
+          <w:szCs w:val="15"/>
+        </w:rPr>
+        <w:t>Registro(</w:t>
+      </w:r>
+      <w:proofErr w:type="spellStart"/>
+      <w:proofErr w:type="gramEnd"/>
       <w:r>
         <w:rPr>
           <w:rFonts w:ascii="Consolas" w:eastAsia="Consolas" w:hAnsi="Consolas" w:cs="Consolas"/>
@@ -3729,7 +4047,25 @@
           <w:sz w:val="15"/>
           <w:szCs w:val="15"/>
         </w:rPr>
-        <w:t xml:space="preserve">    ~Registro() { }</w:t>
+        <w:t xml:space="preserve">    ~</w:t>
+      </w:r>
+      <w:proofErr w:type="gramStart"/>
+      <w:r>
+        <w:rPr>
+          <w:rFonts w:ascii="Consolas" w:eastAsia="Consolas" w:hAnsi="Consolas" w:cs="Consolas"/>
+          <w:sz w:val="15"/>
+          <w:szCs w:val="15"/>
+        </w:rPr>
+        <w:t>Registro(</w:t>
+      </w:r>
+      <w:proofErr w:type="gramEnd"/>
+      <w:r>
+        <w:rPr>
+          <w:rFonts w:ascii="Consolas" w:eastAsia="Consolas" w:hAnsi="Consolas" w:cs="Consolas"/>
+          <w:sz w:val="15"/>
+          <w:szCs w:val="15"/>
+        </w:rPr>
+        <w:t>) { }</w:t>
       </w:r>
     </w:p>
     <w:p>
@@ -3793,8 +4129,18 @@
       </w:r>
       <w:proofErr w:type="spellEnd"/>
       <w:r>
-        <w:t xml:space="preserve"> registro falta el ;</w:t>
-      </w:r>
+        <w:t xml:space="preserve"> registro falta </w:t>
+      </w:r>
+      <w:proofErr w:type="spellStart"/>
+      <w:proofErr w:type="gramStart"/>
+      <w:r>
+        <w:t>el</w:t>
+      </w:r>
+      <w:proofErr w:type="spellEnd"/>
+      <w:r>
+        <w:t xml:space="preserve"> ;</w:t>
+      </w:r>
+      <w:proofErr w:type="gramEnd"/>
     </w:p>
     <w:p>
       <w:pPr>
@@ -4389,6 +4735,9 @@
         <w:spacing w:after="200"/>
       </w:pPr>
       <w:r>
+        <w:rPr>
+          <w:noProof/>
+        </w:rPr>
         <w:drawing>
           <wp:inline distT="0" distB="0" distL="0" distR="0" wp14:anchorId="5A10065B" wp14:editId="19699066">
             <wp:extent cx="6400800" cy="1462405"/>
@@ -4444,7 +4793,15 @@
         <w:spacing w:after="200"/>
       </w:pPr>
       <w:r>
-        <w:t>#  Cívica Software  ·  TCK-4420  ·  Severidad P3</w:t>
+        <w:t xml:space="preserve">#  Cívica </w:t>
+      </w:r>
+      <w:proofErr w:type="gramStart"/>
+      <w:r>
+        <w:t>Software  ·</w:t>
+      </w:r>
+      <w:proofErr w:type="gramEnd"/>
+      <w:r>
+        <w:t xml:space="preserve">  TCK-4420  ·  Severidad P3</w:t>
       </w:r>
     </w:p>
     <w:p>
@@ -4455,12 +4812,17 @@
         <w:t xml:space="preserve">#  Sistema: </w:t>
       </w:r>
       <w:proofErr w:type="spellStart"/>
+      <w:proofErr w:type="gramStart"/>
       <w:r>
         <w:t>RedAcopio</w:t>
       </w:r>
       <w:proofErr w:type="spellEnd"/>
       <w:r>
-        <w:t xml:space="preserve">  —  Reporte de ocupación</w:t>
+        <w:t xml:space="preserve">  —</w:t>
+      </w:r>
+      <w:proofErr w:type="gramEnd"/>
+      <w:r>
+        <w:t xml:space="preserve">  Reporte de ocupación</w:t>
       </w:r>
     </w:p>
     <w:p>
@@ -4660,10 +5022,12 @@
         <w:t xml:space="preserve">        </w:t>
       </w:r>
       <w:proofErr w:type="spellStart"/>
+      <w:proofErr w:type="gramStart"/>
       <w:r>
         <w:t>totales.append</w:t>
       </w:r>
       <w:proofErr w:type="spellEnd"/>
+      <w:proofErr w:type="gramEnd"/>
       <w:r>
         <w:t>(s)</w:t>
       </w:r>
@@ -4784,7 +5148,15 @@
       </w:r>
       <w:proofErr w:type="spellEnd"/>
       <w:r>
-        <w:t xml:space="preserve">(m[0])):   </w:t>
+        <w:t>(</w:t>
+      </w:r>
+      <w:proofErr w:type="gramStart"/>
+      <w:r>
+        <w:t>m[</w:t>
+      </w:r>
+      <w:proofErr w:type="gramEnd"/>
+      <w:r>
+        <w:t xml:space="preserve">0])):   </w:t>
       </w:r>
     </w:p>
     <w:p>
@@ -4884,10 +5256,12 @@
         <w:t xml:space="preserve">        </w:t>
       </w:r>
       <w:proofErr w:type="spellStart"/>
+      <w:proofErr w:type="gramStart"/>
       <w:r>
         <w:t>totales.append</w:t>
       </w:r>
       <w:proofErr w:type="spellEnd"/>
+      <w:proofErr w:type="gramEnd"/>
       <w:r>
         <w:t>(s)</w:t>
       </w:r>
@@ -5048,7 +5422,15 @@
       </w:r>
       <w:proofErr w:type="spellEnd"/>
       <w:r>
-        <w:t>(m[0])):</w:t>
+        <w:t>(</w:t>
+      </w:r>
+      <w:proofErr w:type="gramStart"/>
+      <w:r>
+        <w:t>m[</w:t>
+      </w:r>
+      <w:proofErr w:type="gramEnd"/>
+      <w:r>
+        <w:t>0])):</w:t>
       </w:r>
     </w:p>
     <w:p>
@@ -5132,9 +5514,14 @@
       </w:r>
       <w:proofErr w:type="spellStart"/>
       <w:r>
-        <w:t>total_flojo.append</w:t>
-      </w:r>
-      <w:proofErr w:type="spellEnd"/>
+        <w:t>total_</w:t>
+      </w:r>
+      <w:proofErr w:type="gramStart"/>
+      <w:r>
+        <w:t>flojo.append</w:t>
+      </w:r>
+      <w:proofErr w:type="spellEnd"/>
+      <w:proofErr w:type="gramEnd"/>
       <w:r>
         <w:t>(s)</w:t>
       </w:r>
@@ -5172,9 +5559,14 @@
       </w:r>
       <w:proofErr w:type="spellStart"/>
       <w:r>
-        <w:t>total_flojo.index</w:t>
-      </w:r>
-      <w:proofErr w:type="spellEnd"/>
+        <w:t>total_</w:t>
+      </w:r>
+      <w:proofErr w:type="gramStart"/>
+      <w:r>
+        <w:t>flojo.index</w:t>
+      </w:r>
+      <w:proofErr w:type="spellEnd"/>
+      <w:proofErr w:type="gramEnd"/>
       <w:r>
         <w:t>(min(</w:t>
       </w:r>
@@ -5200,7 +5592,15 @@
       </w:r>
       <w:proofErr w:type="spellEnd"/>
       <w:r>
-        <w:t xml:space="preserve"> y min  que son funciones de </w:t>
+        <w:t xml:space="preserve"> y </w:t>
+      </w:r>
+      <w:proofErr w:type="gramStart"/>
+      <w:r>
+        <w:t>min  que</w:t>
+      </w:r>
+      <w:proofErr w:type="gramEnd"/>
+      <w:r>
+        <w:t xml:space="preserve"> son funciones de </w:t>
       </w:r>
       <w:proofErr w:type="spellStart"/>
       <w:r>
@@ -5575,14 +5975,33 @@
           <w:sz w:val="18"/>
           <w:szCs w:val="18"/>
         </w:rPr>
-        <w:t xml:space="preserve">SON DOS PROBLEMAS DISTINTOS  </w:t>
-      </w:r>
-      <w:r>
-        <w:rPr>
-          <w:sz w:val="19"/>
-          <w:szCs w:val="19"/>
-        </w:rPr>
-        <w:t xml:space="preserve">Este ticket tiene un defecto de lógica y un defecto de memoria. Resuelva primero el de lógica: es el que destraba el código de cierre. El de memoria se verifica aparte, con el </w:t>
+        <w:t xml:space="preserve">SON DOS PROBLEMAS </w:t>
+      </w:r>
+      <w:proofErr w:type="gramStart"/>
+      <w:r>
+        <w:rPr>
+          <w:b/>
+          <w:bCs/>
+          <w:color w:val="8A5200"/>
+          <w:sz w:val="18"/>
+          <w:szCs w:val="18"/>
+        </w:rPr>
+        <w:t xml:space="preserve">DISTINTOS  </w:t>
+      </w:r>
+      <w:r>
+        <w:rPr>
+          <w:sz w:val="19"/>
+          <w:szCs w:val="19"/>
+        </w:rPr>
+        <w:t>Este</w:t>
+      </w:r>
+      <w:proofErr w:type="gramEnd"/>
+      <w:r>
+        <w:rPr>
+          <w:sz w:val="19"/>
+          <w:szCs w:val="19"/>
+        </w:rPr>
+        <w:t xml:space="preserve"> ticket tiene un defecto de lógica y un defecto de memoria. Resuelva primero el de lógica: es el que destraba el código de cierre. El de memoria se verifica aparte, con el </w:t>
       </w:r>
       <w:proofErr w:type="spellStart"/>
       <w:r>
@@ -5912,13 +6331,23 @@
         <w:spacing w:after="120" w:line="220" w:lineRule="auto"/>
         <w:ind w:left="240"/>
       </w:pPr>
-      <w:r>
-        <w:rPr>
-          <w:rFonts w:ascii="Consolas" w:eastAsia="Consolas" w:hAnsi="Consolas" w:cs="Consolas"/>
-          <w:sz w:val="15"/>
-          <w:szCs w:val="15"/>
-        </w:rPr>
-        <w:t>$ ./inventario</w:t>
+      <w:proofErr w:type="gramStart"/>
+      <w:r>
+        <w:rPr>
+          <w:rFonts w:ascii="Consolas" w:eastAsia="Consolas" w:hAnsi="Consolas" w:cs="Consolas"/>
+          <w:sz w:val="15"/>
+          <w:szCs w:val="15"/>
+        </w:rPr>
+        <w:t>$ .</w:t>
+      </w:r>
+      <w:proofErr w:type="gramEnd"/>
+      <w:r>
+        <w:rPr>
+          <w:rFonts w:ascii="Consolas" w:eastAsia="Consolas" w:hAnsi="Consolas" w:cs="Consolas"/>
+          <w:sz w:val="15"/>
+          <w:szCs w:val="15"/>
+        </w:rPr>
+        <w:t>/inventario</w:t>
       </w:r>
     </w:p>
     <w:p>
@@ -6307,6 +6736,7 @@
         <w:t xml:space="preserve"> en vez de </w:t>
       </w:r>
       <w:proofErr w:type="spellStart"/>
+      <w:proofErr w:type="gramStart"/>
       <w:r>
         <w:rPr>
           <w:sz w:val="19"/>
@@ -6320,7 +6750,15 @@
           <w:sz w:val="19"/>
           <w:szCs w:val="19"/>
         </w:rPr>
-        <w:t>[] para memoria reservada con new[].</w:t>
+        <w:t>[</w:t>
+      </w:r>
+      <w:proofErr w:type="gramEnd"/>
+      <w:r>
+        <w:rPr>
+          <w:sz w:val="19"/>
+          <w:szCs w:val="19"/>
+        </w:rPr>
+        <w:t>] para memoria reservada con new[].</w:t>
       </w:r>
     </w:p>
     <w:p>
@@ -6676,7 +7114,23 @@
           <w:sz w:val="19"/>
           <w:szCs w:val="19"/>
         </w:rPr>
-        <w:t>, llamando al método prestar().</w:t>
+        <w:t xml:space="preserve">, llamando al método </w:t>
+      </w:r>
+      <w:proofErr w:type="gramStart"/>
+      <w:r>
+        <w:rPr>
+          <w:sz w:val="19"/>
+          <w:szCs w:val="19"/>
+        </w:rPr>
+        <w:t>prestar(</w:t>
+      </w:r>
+      <w:proofErr w:type="gramEnd"/>
+      <w:r>
+        <w:rPr>
+          <w:sz w:val="19"/>
+          <w:szCs w:val="19"/>
+        </w:rPr>
+        <w:t>).</w:t>
       </w:r>
     </w:p>
     <w:p>
@@ -6695,8 +7149,19 @@
           <w:sz w:val="19"/>
           <w:szCs w:val="19"/>
         </w:rPr>
-        <w:t>Hacer que cada objeto responda con SU propia descripción</w:t>
-      </w:r>
+        <w:t xml:space="preserve">Hacer que cada objeto responda con SU propia </w:t>
+      </w:r>
+      <w:proofErr w:type="gramStart"/>
+      <w:r>
+        <w:rPr>
+          <w:b/>
+          <w:bCs/>
+          <w:sz w:val="19"/>
+          <w:szCs w:val="19"/>
+        </w:rPr>
+        <w:t>descripción</w:t>
+      </w:r>
+      <w:proofErr w:type="gramEnd"/>
       <w:r>
         <w:rPr>
           <w:sz w:val="19"/>
@@ -6902,8 +7367,18 @@
           <w:sz w:val="15"/>
           <w:szCs w:val="15"/>
         </w:rPr>
-        <w:t xml:space="preserve"> pruebas_t4.sh )</w:t>
-      </w:r>
+        <w:t xml:space="preserve"> </w:t>
+      </w:r>
+      <w:proofErr w:type="gramStart"/>
+      <w:r>
+        <w:rPr>
+          <w:rFonts w:ascii="Consolas" w:eastAsia="Consolas" w:hAnsi="Consolas" w:cs="Consolas"/>
+          <w:sz w:val="15"/>
+          <w:szCs w:val="15"/>
+        </w:rPr>
+        <w:t>pruebas_t4.sh )</w:t>
+      </w:r>
+      <w:proofErr w:type="gramEnd"/>
     </w:p>
     <w:p>
       <w:pPr>
@@ -6952,6 +7427,7 @@
         <w:t xml:space="preserve">Olvidar la palabra virtual en el método </w:t>
       </w:r>
       <w:proofErr w:type="spellStart"/>
+      <w:proofErr w:type="gramStart"/>
       <w:r>
         <w:rPr>
           <w:sz w:val="19"/>
@@ -6965,7 +7441,15 @@
           <w:sz w:val="19"/>
           <w:szCs w:val="19"/>
         </w:rPr>
-        <w:t>() de la clase base: los objetos hijos imprimen la descripción del padre.</w:t>
+        <w:t>(</w:t>
+      </w:r>
+      <w:proofErr w:type="gramEnd"/>
+      <w:r>
+        <w:rPr>
+          <w:sz w:val="19"/>
+          <w:szCs w:val="19"/>
+        </w:rPr>
+        <w:t>) de la clase base: los objetos hijos imprimen la descripción del padre.</w:t>
       </w:r>
     </w:p>
     <w:p>
@@ -7232,9 +7716,17 @@
         <w:rPr>
           <w:color w:val="000000"/>
         </w:rPr>
-        <w:t>Corregir el método retirar(</w:t>
-      </w:r>
-      <w:proofErr w:type="spellStart"/>
+        <w:t xml:space="preserve">Corregir el método </w:t>
+      </w:r>
+      <w:proofErr w:type="gramStart"/>
+      <w:r>
+        <w:rPr>
+          <w:color w:val="000000"/>
+        </w:rPr>
+        <w:t>retirar(</w:t>
+      </w:r>
+      <w:proofErr w:type="spellStart"/>
+      <w:proofErr w:type="gramEnd"/>
       <w:r>
         <w:rPr>
           <w:color w:val="000000"/>
@@ -7357,14 +7849,33 @@
           <w:sz w:val="18"/>
           <w:szCs w:val="18"/>
         </w:rPr>
-        <w:t xml:space="preserve">NO CAMBIE LA FIRMA  </w:t>
-      </w:r>
-      <w:r>
-        <w:rPr>
-          <w:sz w:val="19"/>
-          <w:szCs w:val="19"/>
-        </w:rPr>
-        <w:t>El método debe seguir llamándose retirar y recibir un turno. El archivo de pruebas lo llama por su nombre. Tampoco modifique llegar, cuantos ni listar.</w:t>
+        <w:t xml:space="preserve">NO CAMBIE LA </w:t>
+      </w:r>
+      <w:proofErr w:type="gramStart"/>
+      <w:r>
+        <w:rPr>
+          <w:b/>
+          <w:bCs/>
+          <w:color w:val="8A5200"/>
+          <w:sz w:val="18"/>
+          <w:szCs w:val="18"/>
+        </w:rPr>
+        <w:t xml:space="preserve">FIRMA  </w:t>
+      </w:r>
+      <w:r>
+        <w:rPr>
+          <w:sz w:val="19"/>
+          <w:szCs w:val="19"/>
+        </w:rPr>
+        <w:t>El</w:t>
+      </w:r>
+      <w:proofErr w:type="gramEnd"/>
+      <w:r>
+        <w:rPr>
+          <w:sz w:val="19"/>
+          <w:szCs w:val="19"/>
+        </w:rPr>
+        <w:t xml:space="preserve"> método debe seguir llamándose retirar y recibir un turno. El archivo de pruebas lo llama por su nombre. Tampoco modifique llegar, cuantos ni listar.</w:t>
       </w:r>
     </w:p>
     <w:p>
@@ -7552,13 +8063,1335 @@
     <w:p>
       <w:pPr>
         <w:spacing w:after="120"/>
-      </w:pPr>
-      <w:r>
         <w:rPr>
           <w:color w:val="000000"/>
         </w:rPr>
+      </w:pPr>
+      <w:r>
+        <w:rPr>
+          <w:color w:val="000000"/>
+        </w:rPr>
         <w:t>Antes de tocar el código, dibuje en el espacio de abajo tres nodos enlazados y marque con una flecha cuál referencia debe cambiar en cada uno de los tres casos. Este ticket se resuelve más rápido dibujando que probando.</w:t>
       </w:r>
+    </w:p>
+    <w:p>
+      <w:pPr>
+        <w:spacing w:after="120"/>
+        <w:rPr>
+          <w:color w:val="000000"/>
+        </w:rPr>
+      </w:pPr>
+    </w:p>
+    <w:p>
+      <w:pPr>
+        <w:spacing w:after="120"/>
+        <w:rPr>
+          <w:color w:val="000000"/>
+        </w:rPr>
+      </w:pPr>
+    </w:p>
+    <w:p>
+      <w:pPr>
+        <w:spacing w:after="120"/>
+      </w:pPr>
+      <w:r>
+        <w:t># ============================================================</w:t>
+      </w:r>
+    </w:p>
+    <w:p>
+      <w:pPr>
+        <w:spacing w:after="120"/>
+      </w:pPr>
+      <w:r>
+        <w:t xml:space="preserve">#  Cívica </w:t>
+      </w:r>
+      <w:proofErr w:type="gramStart"/>
+      <w:r>
+        <w:t>Software  ·</w:t>
+      </w:r>
+      <w:proofErr w:type="gramEnd"/>
+      <w:r>
+        <w:t xml:space="preserve">  TCK-4423  ·  Severidad P0  ·  PRODUCCION CAIDA</w:t>
+      </w:r>
+    </w:p>
+    <w:p>
+      <w:pPr>
+        <w:spacing w:after="120"/>
+      </w:pPr>
+      <w:r>
+        <w:t xml:space="preserve">#  Sistema: </w:t>
+      </w:r>
+      <w:proofErr w:type="spellStart"/>
+      <w:proofErr w:type="gramStart"/>
+      <w:r>
+        <w:t>TurnoJusto</w:t>
+      </w:r>
+      <w:proofErr w:type="spellEnd"/>
+      <w:r>
+        <w:t xml:space="preserve">  —</w:t>
+      </w:r>
+      <w:proofErr w:type="gramEnd"/>
+      <w:r>
+        <w:t xml:space="preserve">  La fila de </w:t>
+      </w:r>
+      <w:proofErr w:type="spellStart"/>
+      <w:r>
+        <w:t>atencion</w:t>
+      </w:r>
+      <w:proofErr w:type="spellEnd"/>
+      <w:r>
+        <w:t xml:space="preserve"> pierde personas.</w:t>
+      </w:r>
+    </w:p>
+    <w:p>
+      <w:pPr>
+        <w:spacing w:after="120"/>
+      </w:pPr>
+      <w:r>
+        <w:t>#</w:t>
+      </w:r>
+    </w:p>
+    <w:p>
+      <w:pPr>
+        <w:spacing w:after="120"/>
+      </w:pPr>
+      <w:r>
+        <w:t>#  Reportes de soporte:</w:t>
+      </w:r>
+    </w:p>
+    <w:p>
+      <w:pPr>
+        <w:spacing w:after="120"/>
+      </w:pPr>
+      <w:r>
+        <w:t>#   - "</w:t>
+      </w:r>
+      <w:proofErr w:type="spellStart"/>
+      <w:r>
+        <w:t>Atendi</w:t>
+      </w:r>
+      <w:proofErr w:type="spellEnd"/>
+      <w:r>
+        <w:t xml:space="preserve"> al primero de la fila y desaparecieron todos."</w:t>
+      </w:r>
+    </w:p>
+    <w:p>
+      <w:pPr>
+        <w:spacing w:after="120"/>
+      </w:pPr>
+      <w:r>
+        <w:t xml:space="preserve">#   - "Retire a una persona del final y la fila sigue </w:t>
+      </w:r>
+      <w:proofErr w:type="spellStart"/>
+      <w:r>
+        <w:t>mostrandola</w:t>
+      </w:r>
+      <w:proofErr w:type="spellEnd"/>
+      <w:r>
+        <w:t>."</w:t>
+      </w:r>
+    </w:p>
+    <w:p>
+      <w:pPr>
+        <w:spacing w:after="120"/>
+      </w:pPr>
+      <w:r>
+        <w:lastRenderedPageBreak/>
+        <w:t xml:space="preserve">#   - "La fila dice que tiene gente cuando esta </w:t>
+      </w:r>
+      <w:proofErr w:type="spellStart"/>
+      <w:r>
+        <w:t>vacia</w:t>
+      </w:r>
+      <w:proofErr w:type="spellEnd"/>
+      <w:r>
+        <w:t>."</w:t>
+      </w:r>
+    </w:p>
+    <w:p>
+      <w:pPr>
+        <w:spacing w:after="120"/>
+      </w:pPr>
+      <w:r>
+        <w:t># ============================================================</w:t>
+      </w:r>
+    </w:p>
+    <w:p>
+      <w:pPr>
+        <w:spacing w:after="120"/>
+      </w:pPr>
+    </w:p>
+    <w:p>
+      <w:pPr>
+        <w:spacing w:after="120"/>
+      </w:pPr>
+      <w:proofErr w:type="spellStart"/>
+      <w:r>
+        <w:t>class</w:t>
+      </w:r>
+      <w:proofErr w:type="spellEnd"/>
+      <w:r>
+        <w:t xml:space="preserve"> Nodo:</w:t>
+      </w:r>
+    </w:p>
+    <w:p>
+      <w:pPr>
+        <w:spacing w:after="120"/>
+      </w:pPr>
+      <w:r>
+        <w:t xml:space="preserve">    </w:t>
+      </w:r>
+      <w:proofErr w:type="spellStart"/>
+      <w:r>
+        <w:t>def</w:t>
+      </w:r>
+      <w:proofErr w:type="spellEnd"/>
+      <w:r>
+        <w:t xml:space="preserve"> __</w:t>
+      </w:r>
+      <w:proofErr w:type="spellStart"/>
+      <w:r>
+        <w:t>init</w:t>
+      </w:r>
+      <w:proofErr w:type="spellEnd"/>
+      <w:r>
+        <w:t>_</w:t>
+      </w:r>
+      <w:proofErr w:type="gramStart"/>
+      <w:r>
+        <w:t>_(</w:t>
+      </w:r>
+      <w:proofErr w:type="spellStart"/>
+      <w:proofErr w:type="gramEnd"/>
+      <w:r>
+        <w:t>self</w:t>
+      </w:r>
+      <w:proofErr w:type="spellEnd"/>
+      <w:r>
+        <w:t>, turno, nombre):</w:t>
+      </w:r>
+    </w:p>
+    <w:p>
+      <w:pPr>
+        <w:spacing w:after="120"/>
+      </w:pPr>
+      <w:r>
+        <w:t>        #se definen los atributos de la clase Nodo</w:t>
+      </w:r>
+    </w:p>
+    <w:p>
+      <w:pPr>
+        <w:spacing w:after="120"/>
+      </w:pPr>
+      <w:r>
+        <w:t xml:space="preserve">        </w:t>
+      </w:r>
+      <w:proofErr w:type="spellStart"/>
+      <w:proofErr w:type="gramStart"/>
+      <w:r>
+        <w:t>self.turno</w:t>
+      </w:r>
+      <w:proofErr w:type="spellEnd"/>
+      <w:proofErr w:type="gramEnd"/>
+      <w:r>
+        <w:t xml:space="preserve"> = turno</w:t>
+      </w:r>
+    </w:p>
+    <w:p>
+      <w:pPr>
+        <w:spacing w:after="120"/>
+      </w:pPr>
+      <w:r>
+        <w:t xml:space="preserve">        </w:t>
+      </w:r>
+      <w:proofErr w:type="spellStart"/>
+      <w:proofErr w:type="gramStart"/>
+      <w:r>
+        <w:t>self.nombre</w:t>
+      </w:r>
+      <w:proofErr w:type="spellEnd"/>
+      <w:proofErr w:type="gramEnd"/>
+      <w:r>
+        <w:t xml:space="preserve"> = nombre</w:t>
+      </w:r>
+    </w:p>
+    <w:p>
+      <w:pPr>
+        <w:spacing w:after="120"/>
+      </w:pPr>
+      <w:r>
+        <w:t xml:space="preserve">        </w:t>
+      </w:r>
+      <w:proofErr w:type="spellStart"/>
+      <w:proofErr w:type="gramStart"/>
+      <w:r>
+        <w:t>self.siguiente</w:t>
+      </w:r>
+      <w:proofErr w:type="spellEnd"/>
+      <w:proofErr w:type="gramEnd"/>
+      <w:r>
+        <w:t xml:space="preserve"> = </w:t>
+      </w:r>
+      <w:proofErr w:type="spellStart"/>
+      <w:r>
+        <w:t>None</w:t>
+      </w:r>
+      <w:proofErr w:type="spellEnd"/>
+    </w:p>
+    <w:p>
+      <w:pPr>
+        <w:spacing w:after="120"/>
+      </w:pPr>
+      <w:r>
+        <w:t>        #se define el atributo siguiente que apunta al siguiente nodo de la fila</w:t>
+      </w:r>
+    </w:p>
+    <w:p>
+      <w:pPr>
+        <w:spacing w:after="120"/>
+      </w:pPr>
+    </w:p>
+    <w:p>
+      <w:pPr>
+        <w:spacing w:after="120"/>
+      </w:pPr>
+      <w:proofErr w:type="spellStart"/>
+      <w:r>
+        <w:t>class</w:t>
+      </w:r>
+      <w:proofErr w:type="spellEnd"/>
+      <w:r>
+        <w:t xml:space="preserve"> Fila:</w:t>
+      </w:r>
+    </w:p>
+    <w:p>
+      <w:pPr>
+        <w:spacing w:after="120"/>
+      </w:pPr>
+      <w:r>
+        <w:t xml:space="preserve">    </w:t>
+      </w:r>
+      <w:proofErr w:type="spellStart"/>
+      <w:r>
+        <w:t>def</w:t>
+      </w:r>
+      <w:proofErr w:type="spellEnd"/>
+      <w:r>
+        <w:t xml:space="preserve"> __</w:t>
+      </w:r>
+      <w:proofErr w:type="spellStart"/>
+      <w:r>
+        <w:t>init</w:t>
+      </w:r>
+      <w:proofErr w:type="spellEnd"/>
+      <w:r>
+        <w:t>__(</w:t>
+      </w:r>
+      <w:proofErr w:type="spellStart"/>
+      <w:r>
+        <w:t>self</w:t>
+      </w:r>
+      <w:proofErr w:type="spellEnd"/>
+      <w:r>
+        <w:t>):</w:t>
+      </w:r>
+    </w:p>
+    <w:p>
+      <w:pPr>
+        <w:spacing w:after="120"/>
+      </w:pPr>
+      <w:r>
+        <w:t xml:space="preserve">        </w:t>
+      </w:r>
+      <w:proofErr w:type="spellStart"/>
+      <w:proofErr w:type="gramStart"/>
+      <w:r>
+        <w:t>self.cabeza</w:t>
+      </w:r>
+      <w:proofErr w:type="spellEnd"/>
+      <w:proofErr w:type="gramEnd"/>
+      <w:r>
+        <w:t xml:space="preserve"> = </w:t>
+      </w:r>
+      <w:proofErr w:type="spellStart"/>
+      <w:r>
+        <w:t>None</w:t>
+      </w:r>
+      <w:proofErr w:type="spellEnd"/>
+    </w:p>
+    <w:p>
+      <w:pPr>
+        <w:spacing w:after="120"/>
+      </w:pPr>
+      <w:r>
+        <w:t>        #se define el atributo de la clase Fila que apunta al primer nodo de la fila</w:t>
+      </w:r>
+    </w:p>
+    <w:p>
+      <w:pPr>
+        <w:spacing w:after="120"/>
+      </w:pPr>
+    </w:p>
+    <w:p>
+      <w:pPr>
+        <w:spacing w:after="120"/>
+      </w:pPr>
+      <w:r>
+        <w:t xml:space="preserve">    </w:t>
+      </w:r>
+      <w:proofErr w:type="spellStart"/>
+      <w:r>
+        <w:t>def</w:t>
+      </w:r>
+      <w:proofErr w:type="spellEnd"/>
+      <w:r>
+        <w:t xml:space="preserve"> </w:t>
+      </w:r>
+      <w:proofErr w:type="gramStart"/>
+      <w:r>
+        <w:t>llegar(</w:t>
+      </w:r>
+      <w:proofErr w:type="spellStart"/>
+      <w:proofErr w:type="gramEnd"/>
+      <w:r>
+        <w:t>self</w:t>
+      </w:r>
+      <w:proofErr w:type="spellEnd"/>
+      <w:r>
+        <w:t>, turno, nombre):</w:t>
+      </w:r>
+    </w:p>
+    <w:p>
+      <w:pPr>
+        <w:spacing w:after="120"/>
+      </w:pPr>
+      <w:r>
+        <w:t xml:space="preserve">        #se define el </w:t>
+      </w:r>
+      <w:proofErr w:type="spellStart"/>
+      <w:r>
+        <w:t>metodo</w:t>
+      </w:r>
+      <w:proofErr w:type="spellEnd"/>
+      <w:r>
+        <w:t xml:space="preserve"> llegar que agrega un nodo al final de la fila</w:t>
+      </w:r>
+    </w:p>
+    <w:p>
+      <w:pPr>
+        <w:spacing w:after="120"/>
+      </w:pPr>
+      <w:r>
+        <w:t>        """Agrega una persona al FINAL de la fila."""</w:t>
+      </w:r>
+    </w:p>
+    <w:p>
+      <w:pPr>
+        <w:spacing w:after="120"/>
+      </w:pPr>
+      <w:r>
+        <w:t xml:space="preserve">        nuevo = </w:t>
+      </w:r>
+      <w:proofErr w:type="gramStart"/>
+      <w:r>
+        <w:t>Nodo(</w:t>
+      </w:r>
+      <w:proofErr w:type="gramEnd"/>
+      <w:r>
+        <w:t>turno, nombre)</w:t>
+      </w:r>
+    </w:p>
+    <w:p>
+      <w:pPr>
+        <w:spacing w:after="120"/>
+      </w:pPr>
+      <w:r>
+        <w:t xml:space="preserve">        </w:t>
+      </w:r>
+      <w:proofErr w:type="spellStart"/>
+      <w:r>
+        <w:t>if</w:t>
+      </w:r>
+      <w:proofErr w:type="spellEnd"/>
+      <w:r>
+        <w:t xml:space="preserve"> </w:t>
+      </w:r>
+      <w:proofErr w:type="spellStart"/>
+      <w:proofErr w:type="gramStart"/>
+      <w:r>
+        <w:t>self.cabeza</w:t>
+      </w:r>
+      <w:proofErr w:type="spellEnd"/>
+      <w:proofErr w:type="gramEnd"/>
+      <w:r>
+        <w:t xml:space="preserve"> </w:t>
+      </w:r>
+      <w:proofErr w:type="spellStart"/>
+      <w:r>
+        <w:t>is</w:t>
+      </w:r>
+      <w:proofErr w:type="spellEnd"/>
+      <w:r>
+        <w:t xml:space="preserve"> </w:t>
+      </w:r>
+      <w:proofErr w:type="spellStart"/>
+      <w:r>
+        <w:t>None</w:t>
+      </w:r>
+      <w:proofErr w:type="spellEnd"/>
+      <w:r>
+        <w:t>:</w:t>
+      </w:r>
+    </w:p>
+    <w:p>
+      <w:pPr>
+        <w:spacing w:after="120"/>
+      </w:pPr>
+      <w:r>
+        <w:t xml:space="preserve">            </w:t>
+      </w:r>
+      <w:proofErr w:type="spellStart"/>
+      <w:proofErr w:type="gramStart"/>
+      <w:r>
+        <w:t>self.cabeza</w:t>
+      </w:r>
+      <w:proofErr w:type="spellEnd"/>
+      <w:proofErr w:type="gramEnd"/>
+      <w:r>
+        <w:t xml:space="preserve"> = nuevo</w:t>
+      </w:r>
+    </w:p>
+    <w:p>
+      <w:pPr>
+        <w:spacing w:after="120"/>
+      </w:pPr>
+      <w:r>
+        <w:t xml:space="preserve">            </w:t>
+      </w:r>
+      <w:proofErr w:type="spellStart"/>
+      <w:r>
+        <w:t>return</w:t>
+      </w:r>
+      <w:proofErr w:type="spellEnd"/>
+    </w:p>
+    <w:p>
+      <w:pPr>
+        <w:spacing w:after="120"/>
+      </w:pPr>
+      <w:r>
+        <w:t xml:space="preserve">        actual = </w:t>
+      </w:r>
+      <w:proofErr w:type="spellStart"/>
+      <w:proofErr w:type="gramStart"/>
+      <w:r>
+        <w:t>self.cabeza</w:t>
+      </w:r>
+      <w:proofErr w:type="spellEnd"/>
+      <w:proofErr w:type="gramEnd"/>
+    </w:p>
+    <w:p>
+      <w:pPr>
+        <w:spacing w:after="120"/>
+      </w:pPr>
+      <w:r>
+        <w:t xml:space="preserve">        </w:t>
+      </w:r>
+      <w:proofErr w:type="spellStart"/>
+      <w:r>
+        <w:t>while</w:t>
+      </w:r>
+      <w:proofErr w:type="spellEnd"/>
+      <w:r>
+        <w:t xml:space="preserve"> </w:t>
+      </w:r>
+      <w:proofErr w:type="spellStart"/>
+      <w:proofErr w:type="gramStart"/>
+      <w:r>
+        <w:t>actual.siguiente</w:t>
+      </w:r>
+      <w:proofErr w:type="spellEnd"/>
+      <w:proofErr w:type="gramEnd"/>
+      <w:r>
+        <w:t xml:space="preserve"> </w:t>
+      </w:r>
+      <w:proofErr w:type="spellStart"/>
+      <w:r>
+        <w:t>is</w:t>
+      </w:r>
+      <w:proofErr w:type="spellEnd"/>
+      <w:r>
+        <w:t xml:space="preserve"> </w:t>
+      </w:r>
+      <w:proofErr w:type="spellStart"/>
+      <w:r>
+        <w:t>not</w:t>
+      </w:r>
+      <w:proofErr w:type="spellEnd"/>
+      <w:r>
+        <w:t xml:space="preserve"> </w:t>
+      </w:r>
+      <w:proofErr w:type="spellStart"/>
+      <w:r>
+        <w:t>None</w:t>
+      </w:r>
+      <w:proofErr w:type="spellEnd"/>
+      <w:r>
+        <w:t>:</w:t>
+      </w:r>
+    </w:p>
+    <w:p>
+      <w:pPr>
+        <w:spacing w:after="120"/>
+      </w:pPr>
+      <w:r>
+        <w:t xml:space="preserve">            actual = </w:t>
+      </w:r>
+      <w:proofErr w:type="spellStart"/>
+      <w:proofErr w:type="gramStart"/>
+      <w:r>
+        <w:t>actual.siguiente</w:t>
+      </w:r>
+      <w:proofErr w:type="spellEnd"/>
+      <w:proofErr w:type="gramEnd"/>
+    </w:p>
+    <w:p>
+      <w:pPr>
+        <w:spacing w:after="120"/>
+      </w:pPr>
+      <w:r>
+        <w:t xml:space="preserve">        </w:t>
+      </w:r>
+      <w:proofErr w:type="spellStart"/>
+      <w:proofErr w:type="gramStart"/>
+      <w:r>
+        <w:t>actual.siguiente</w:t>
+      </w:r>
+      <w:proofErr w:type="spellEnd"/>
+      <w:proofErr w:type="gramEnd"/>
+      <w:r>
+        <w:t xml:space="preserve"> = nuevo</w:t>
+      </w:r>
+    </w:p>
+    <w:p>
+      <w:pPr>
+        <w:spacing w:after="120"/>
+      </w:pPr>
+    </w:p>
+    <w:p>
+      <w:pPr>
+        <w:spacing w:after="120"/>
+      </w:pPr>
+      <w:r>
+        <w:t xml:space="preserve">    </w:t>
+      </w:r>
+      <w:proofErr w:type="spellStart"/>
+      <w:r>
+        <w:t>def</w:t>
+      </w:r>
+      <w:proofErr w:type="spellEnd"/>
+      <w:r>
+        <w:t xml:space="preserve"> </w:t>
+      </w:r>
+      <w:proofErr w:type="gramStart"/>
+      <w:r>
+        <w:t>retirar(</w:t>
+      </w:r>
+      <w:proofErr w:type="spellStart"/>
+      <w:proofErr w:type="gramEnd"/>
+      <w:r>
+        <w:t>self</w:t>
+      </w:r>
+      <w:proofErr w:type="spellEnd"/>
+      <w:r>
+        <w:t>, turno):</w:t>
+      </w:r>
+    </w:p>
+    <w:p>
+      <w:pPr>
+        <w:spacing w:after="120"/>
+      </w:pPr>
+      <w:r>
+        <w:t>        """Elimina de la fila a la persona con ese turno.</w:t>
+      </w:r>
+    </w:p>
+    <w:p>
+      <w:pPr>
+        <w:spacing w:after="120"/>
+      </w:pPr>
+      <w:r>
+        <w:t>           Devuelve True si la elimino, False si no estaba.</w:t>
+      </w:r>
+    </w:p>
+    <w:p>
+      <w:pPr>
+        <w:spacing w:after="120"/>
+      </w:pPr>
+      <w:r>
+        <w:t>           BUG P0: revise los tres casos."""</w:t>
+      </w:r>
+    </w:p>
+    <w:p>
+      <w:pPr>
+        <w:spacing w:after="120"/>
+      </w:pPr>
+      <w:r>
+        <w:t xml:space="preserve">        </w:t>
+      </w:r>
+      <w:proofErr w:type="spellStart"/>
+      <w:r>
+        <w:t>if</w:t>
+      </w:r>
+      <w:proofErr w:type="spellEnd"/>
+      <w:r>
+        <w:t xml:space="preserve"> </w:t>
+      </w:r>
+      <w:proofErr w:type="spellStart"/>
+      <w:proofErr w:type="gramStart"/>
+      <w:r>
+        <w:t>self.cabeza</w:t>
+      </w:r>
+      <w:proofErr w:type="spellEnd"/>
+      <w:proofErr w:type="gramEnd"/>
+      <w:r>
+        <w:t xml:space="preserve"> </w:t>
+      </w:r>
+      <w:proofErr w:type="spellStart"/>
+      <w:r>
+        <w:t>is</w:t>
+      </w:r>
+      <w:proofErr w:type="spellEnd"/>
+      <w:r>
+        <w:t xml:space="preserve"> </w:t>
+      </w:r>
+      <w:proofErr w:type="spellStart"/>
+      <w:r>
+        <w:t>None</w:t>
+      </w:r>
+      <w:proofErr w:type="spellEnd"/>
+      <w:r>
+        <w:t>:</w:t>
+      </w:r>
+    </w:p>
+    <w:p>
+      <w:pPr>
+        <w:spacing w:after="120"/>
+      </w:pPr>
+      <w:r>
+        <w:t xml:space="preserve">            #la fila esta </w:t>
+      </w:r>
+      <w:proofErr w:type="spellStart"/>
+      <w:r>
+        <w:t>vacia</w:t>
+      </w:r>
+      <w:proofErr w:type="spellEnd"/>
+      <w:r>
+        <w:t>, no hay nadie que eliminar</w:t>
+      </w:r>
+    </w:p>
+    <w:p>
+      <w:pPr>
+        <w:spacing w:after="120"/>
+      </w:pPr>
+      <w:r>
+        <w:t xml:space="preserve">            </w:t>
+      </w:r>
+      <w:proofErr w:type="spellStart"/>
+      <w:r>
+        <w:t>return</w:t>
+      </w:r>
+      <w:proofErr w:type="spellEnd"/>
+      <w:r>
+        <w:t xml:space="preserve"> False</w:t>
+      </w:r>
+    </w:p>
+    <w:p>
+      <w:pPr>
+        <w:spacing w:after="120"/>
+      </w:pPr>
+      <w:r>
+        <w:t xml:space="preserve">        </w:t>
+      </w:r>
+      <w:proofErr w:type="spellStart"/>
+      <w:r>
+        <w:t>if</w:t>
+      </w:r>
+      <w:proofErr w:type="spellEnd"/>
+      <w:r>
+        <w:t xml:space="preserve"> </w:t>
+      </w:r>
+      <w:proofErr w:type="spellStart"/>
+      <w:proofErr w:type="gramStart"/>
+      <w:r>
+        <w:t>self.cabeza</w:t>
+      </w:r>
+      <w:proofErr w:type="gramEnd"/>
+      <w:r>
+        <w:t>.turno</w:t>
+      </w:r>
+      <w:proofErr w:type="spellEnd"/>
+      <w:r>
+        <w:t xml:space="preserve"> == turno:</w:t>
+      </w:r>
+    </w:p>
+    <w:p>
+      <w:pPr>
+        <w:spacing w:after="120"/>
+      </w:pPr>
+      <w:r>
+        <w:t>            #el primer nodo de la fila es el que se quiere eliminar</w:t>
+      </w:r>
+    </w:p>
+    <w:p>
+      <w:pPr>
+        <w:spacing w:after="120"/>
+      </w:pPr>
+      <w:r>
+        <w:t xml:space="preserve">            </w:t>
+      </w:r>
+      <w:proofErr w:type="spellStart"/>
+      <w:proofErr w:type="gramStart"/>
+      <w:r>
+        <w:t>self.cabeza</w:t>
+      </w:r>
+      <w:proofErr w:type="spellEnd"/>
+      <w:proofErr w:type="gramEnd"/>
+      <w:r>
+        <w:t xml:space="preserve"> = </w:t>
+      </w:r>
+      <w:proofErr w:type="spellStart"/>
+      <w:r>
+        <w:t>self.cabeza.siguiente</w:t>
+      </w:r>
+      <w:proofErr w:type="spellEnd"/>
+      <w:r>
+        <w:t xml:space="preserve">  # &lt;-- caso 1</w:t>
+      </w:r>
+    </w:p>
+    <w:p>
+      <w:pPr>
+        <w:spacing w:after="120"/>
+      </w:pPr>
+    </w:p>
+    <w:p>
+      <w:pPr>
+        <w:spacing w:after="120"/>
+      </w:pPr>
+      <w:r>
+        <w:t xml:space="preserve">            </w:t>
+      </w:r>
+      <w:proofErr w:type="spellStart"/>
+      <w:r>
+        <w:t>return</w:t>
+      </w:r>
+      <w:proofErr w:type="spellEnd"/>
+      <w:r>
+        <w:t xml:space="preserve"> True</w:t>
+      </w:r>
+    </w:p>
+    <w:p>
+      <w:pPr>
+        <w:spacing w:after="120"/>
+      </w:pPr>
+      <w:r>
+        <w:t xml:space="preserve">        </w:t>
+      </w:r>
+    </w:p>
+    <w:p>
+      <w:pPr>
+        <w:spacing w:after="120"/>
+      </w:pPr>
+      <w:r>
+        <w:t xml:space="preserve">        anterior = </w:t>
+      </w:r>
+      <w:proofErr w:type="spellStart"/>
+      <w:proofErr w:type="gramStart"/>
+      <w:r>
+        <w:t>self.cabeza</w:t>
+      </w:r>
+      <w:proofErr w:type="spellEnd"/>
+      <w:proofErr w:type="gramEnd"/>
+    </w:p>
+    <w:p>
+      <w:pPr>
+        <w:spacing w:after="120"/>
+      </w:pPr>
+      <w:r>
+        <w:t xml:space="preserve">        </w:t>
+      </w:r>
+      <w:proofErr w:type="spellStart"/>
+      <w:r>
+        <w:t>while</w:t>
+      </w:r>
+      <w:proofErr w:type="spellEnd"/>
+      <w:r>
+        <w:t xml:space="preserve"> </w:t>
+      </w:r>
+      <w:proofErr w:type="spellStart"/>
+      <w:proofErr w:type="gramStart"/>
+      <w:r>
+        <w:t>anterior.siguiente</w:t>
+      </w:r>
+      <w:proofErr w:type="spellEnd"/>
+      <w:proofErr w:type="gramEnd"/>
+      <w:r>
+        <w:t xml:space="preserve"> </w:t>
+      </w:r>
+      <w:proofErr w:type="spellStart"/>
+      <w:r>
+        <w:t>is</w:t>
+      </w:r>
+      <w:proofErr w:type="spellEnd"/>
+      <w:r>
+        <w:t xml:space="preserve"> </w:t>
+      </w:r>
+      <w:proofErr w:type="spellStart"/>
+      <w:r>
+        <w:t>not</w:t>
+      </w:r>
+      <w:proofErr w:type="spellEnd"/>
+      <w:r>
+        <w:t xml:space="preserve"> </w:t>
+      </w:r>
+      <w:proofErr w:type="spellStart"/>
+      <w:r>
+        <w:t>None</w:t>
+      </w:r>
+      <w:proofErr w:type="spellEnd"/>
+      <w:r>
+        <w:t>:</w:t>
+      </w:r>
+    </w:p>
+    <w:p>
+      <w:pPr>
+        <w:spacing w:after="120"/>
+      </w:pPr>
+      <w:r>
+        <w:t>            #confirma que haya un nodo siguiente al actual</w:t>
+      </w:r>
+    </w:p>
+    <w:p>
+      <w:pPr>
+        <w:spacing w:after="120"/>
+      </w:pPr>
+      <w:r>
+        <w:t xml:space="preserve">            </w:t>
+      </w:r>
+      <w:proofErr w:type="spellStart"/>
+      <w:r>
+        <w:t>if</w:t>
+      </w:r>
+      <w:proofErr w:type="spellEnd"/>
+      <w:r>
+        <w:t xml:space="preserve"> </w:t>
+      </w:r>
+      <w:proofErr w:type="spellStart"/>
+      <w:proofErr w:type="gramStart"/>
+      <w:r>
+        <w:t>anterior.siguiente</w:t>
+      </w:r>
+      <w:proofErr w:type="gramEnd"/>
+      <w:r>
+        <w:t>.turno</w:t>
+      </w:r>
+      <w:proofErr w:type="spellEnd"/>
+      <w:r>
+        <w:t xml:space="preserve"> == turno:</w:t>
+      </w:r>
+    </w:p>
+    <w:p>
+      <w:pPr>
+        <w:spacing w:after="120"/>
+      </w:pPr>
+      <w:r>
+        <w:t>                #se toma el nodo siguiente al actual</w:t>
+      </w:r>
+    </w:p>
+    <w:p>
+      <w:pPr>
+        <w:spacing w:after="120"/>
+      </w:pPr>
+      <w:r>
+        <w:t xml:space="preserve">                </w:t>
+      </w:r>
+      <w:proofErr w:type="spellStart"/>
+      <w:proofErr w:type="gramStart"/>
+      <w:r>
+        <w:t>anterior.siguiente</w:t>
+      </w:r>
+      <w:proofErr w:type="spellEnd"/>
+      <w:proofErr w:type="gramEnd"/>
+      <w:r>
+        <w:t xml:space="preserve"> = </w:t>
+      </w:r>
+      <w:proofErr w:type="spellStart"/>
+      <w:r>
+        <w:t>anterior.siguiente.siguiente</w:t>
+      </w:r>
+      <w:proofErr w:type="spellEnd"/>
+      <w:r>
+        <w:t xml:space="preserve">  # &lt;-- caso 2</w:t>
+      </w:r>
+    </w:p>
+    <w:p>
+      <w:pPr>
+        <w:spacing w:after="120"/>
+      </w:pPr>
+      <w:r>
+        <w:t>                #se reemplaza el nodo siguiente al actual por el nodo siguiente al nodo que se quiere eliminar</w:t>
+      </w:r>
+    </w:p>
+    <w:p>
+      <w:pPr>
+        <w:spacing w:after="120"/>
+      </w:pPr>
+      <w:r>
+        <w:t xml:space="preserve">                </w:t>
+      </w:r>
+      <w:proofErr w:type="spellStart"/>
+      <w:r>
+        <w:t>return</w:t>
+      </w:r>
+      <w:proofErr w:type="spellEnd"/>
+      <w:r>
+        <w:t xml:space="preserve"> True</w:t>
+      </w:r>
+    </w:p>
+    <w:p>
+      <w:pPr>
+        <w:spacing w:after="120"/>
+      </w:pPr>
+      <w:r>
+        <w:t xml:space="preserve">            anterior = </w:t>
+      </w:r>
+      <w:proofErr w:type="spellStart"/>
+      <w:proofErr w:type="gramStart"/>
+      <w:r>
+        <w:t>anterior.siguiente</w:t>
+      </w:r>
+      <w:proofErr w:type="spellEnd"/>
+      <w:proofErr w:type="gramEnd"/>
+    </w:p>
+    <w:p>
+      <w:pPr>
+        <w:spacing w:after="120"/>
+      </w:pPr>
+      <w:r>
+        <w:t xml:space="preserve">        </w:t>
+      </w:r>
+    </w:p>
+    <w:p>
+      <w:pPr>
+        <w:spacing w:after="120"/>
+      </w:pPr>
+      <w:r>
+        <w:t xml:space="preserve">        </w:t>
+      </w:r>
+      <w:proofErr w:type="spellStart"/>
+      <w:r>
+        <w:t>return</w:t>
+      </w:r>
+      <w:proofErr w:type="spellEnd"/>
+      <w:r>
+        <w:t xml:space="preserve"> False</w:t>
+      </w:r>
+    </w:p>
+    <w:p>
+      <w:pPr>
+        <w:spacing w:after="120"/>
+      </w:pPr>
+    </w:p>
+    <w:p>
+      <w:pPr>
+        <w:spacing w:after="120"/>
+      </w:pPr>
+      <w:r>
+        <w:t xml:space="preserve">    </w:t>
+      </w:r>
+      <w:proofErr w:type="spellStart"/>
+      <w:r>
+        <w:t>def</w:t>
+      </w:r>
+      <w:proofErr w:type="spellEnd"/>
+      <w:r>
+        <w:t xml:space="preserve"> cuantos(</w:t>
+      </w:r>
+      <w:proofErr w:type="spellStart"/>
+      <w:r>
+        <w:t>self</w:t>
+      </w:r>
+      <w:proofErr w:type="spellEnd"/>
+      <w:r>
+        <w:t>):</w:t>
+      </w:r>
+    </w:p>
+    <w:p>
+      <w:pPr>
+        <w:spacing w:after="120"/>
+      </w:pPr>
+      <w:r>
+        <w:t>        """Devuelve cuantas personas hay en la fila."""</w:t>
+      </w:r>
+    </w:p>
+    <w:p>
+      <w:pPr>
+        <w:spacing w:after="120"/>
+      </w:pPr>
+      <w:r>
+        <w:t>        n = 0</w:t>
+      </w:r>
+    </w:p>
+    <w:p>
+      <w:pPr>
+        <w:spacing w:after="120"/>
+      </w:pPr>
+      <w:r>
+        <w:t xml:space="preserve">        actual = </w:t>
+      </w:r>
+      <w:proofErr w:type="spellStart"/>
+      <w:proofErr w:type="gramStart"/>
+      <w:r>
+        <w:t>self.cabeza</w:t>
+      </w:r>
+      <w:proofErr w:type="spellEnd"/>
+      <w:proofErr w:type="gramEnd"/>
+    </w:p>
+    <w:p>
+      <w:pPr>
+        <w:spacing w:after="120"/>
+      </w:pPr>
+      <w:r>
+        <w:t xml:space="preserve">        </w:t>
+      </w:r>
+      <w:proofErr w:type="spellStart"/>
+      <w:r>
+        <w:t>while</w:t>
+      </w:r>
+      <w:proofErr w:type="spellEnd"/>
+      <w:r>
+        <w:t xml:space="preserve"> actual </w:t>
+      </w:r>
+      <w:proofErr w:type="spellStart"/>
+      <w:r>
+        <w:t>is</w:t>
+      </w:r>
+      <w:proofErr w:type="spellEnd"/>
+      <w:r>
+        <w:t xml:space="preserve"> </w:t>
+      </w:r>
+      <w:proofErr w:type="spellStart"/>
+      <w:r>
+        <w:t>not</w:t>
+      </w:r>
+      <w:proofErr w:type="spellEnd"/>
+      <w:r>
+        <w:t xml:space="preserve"> </w:t>
+      </w:r>
+      <w:proofErr w:type="spellStart"/>
+      <w:r>
+        <w:t>None</w:t>
+      </w:r>
+      <w:proofErr w:type="spellEnd"/>
+      <w:r>
+        <w:t>:</w:t>
+      </w:r>
+    </w:p>
+    <w:p>
+      <w:pPr>
+        <w:spacing w:after="120"/>
+      </w:pPr>
+      <w:r>
+        <w:t>            n += 1</w:t>
+      </w:r>
+    </w:p>
+    <w:p>
+      <w:pPr>
+        <w:spacing w:after="120"/>
+      </w:pPr>
+      <w:r>
+        <w:t xml:space="preserve">            actual = </w:t>
+      </w:r>
+      <w:proofErr w:type="spellStart"/>
+      <w:proofErr w:type="gramStart"/>
+      <w:r>
+        <w:t>actual.siguiente</w:t>
+      </w:r>
+      <w:proofErr w:type="spellEnd"/>
+      <w:proofErr w:type="gramEnd"/>
+    </w:p>
+    <w:p>
+      <w:pPr>
+        <w:spacing w:after="120"/>
+      </w:pPr>
+      <w:r>
+        <w:t xml:space="preserve">        </w:t>
+      </w:r>
+      <w:proofErr w:type="spellStart"/>
+      <w:r>
+        <w:t>return</w:t>
+      </w:r>
+      <w:proofErr w:type="spellEnd"/>
+      <w:r>
+        <w:t xml:space="preserve"> n</w:t>
+      </w:r>
+    </w:p>
+    <w:p>
+      <w:pPr>
+        <w:spacing w:after="120"/>
+      </w:pPr>
+    </w:p>
+    <w:p>
+      <w:pPr>
+        <w:spacing w:after="120"/>
+      </w:pPr>
+      <w:r>
+        <w:t xml:space="preserve">    </w:t>
+      </w:r>
+      <w:proofErr w:type="spellStart"/>
+      <w:r>
+        <w:t>def</w:t>
+      </w:r>
+      <w:proofErr w:type="spellEnd"/>
+      <w:r>
+        <w:t xml:space="preserve"> listar(</w:t>
+      </w:r>
+      <w:proofErr w:type="spellStart"/>
+      <w:r>
+        <w:t>self</w:t>
+      </w:r>
+      <w:proofErr w:type="spellEnd"/>
+      <w:r>
+        <w:t>):</w:t>
+      </w:r>
+    </w:p>
+    <w:p>
+      <w:pPr>
+        <w:spacing w:after="120"/>
+      </w:pPr>
+      <w:r>
+        <w:t>        r = []</w:t>
+      </w:r>
+    </w:p>
+    <w:p>
+      <w:pPr>
+        <w:spacing w:after="120"/>
+      </w:pPr>
+      <w:r>
+        <w:t xml:space="preserve">        actual = </w:t>
+      </w:r>
+      <w:proofErr w:type="spellStart"/>
+      <w:proofErr w:type="gramStart"/>
+      <w:r>
+        <w:t>self.cabeza</w:t>
+      </w:r>
+      <w:proofErr w:type="spellEnd"/>
+      <w:proofErr w:type="gramEnd"/>
+    </w:p>
+    <w:p>
+      <w:pPr>
+        <w:spacing w:after="120"/>
+      </w:pPr>
+      <w:r>
+        <w:t xml:space="preserve">        </w:t>
+      </w:r>
+      <w:proofErr w:type="spellStart"/>
+      <w:r>
+        <w:t>while</w:t>
+      </w:r>
+      <w:proofErr w:type="spellEnd"/>
+      <w:r>
+        <w:t xml:space="preserve"> actual </w:t>
+      </w:r>
+      <w:proofErr w:type="spellStart"/>
+      <w:r>
+        <w:t>is</w:t>
+      </w:r>
+      <w:proofErr w:type="spellEnd"/>
+      <w:r>
+        <w:t xml:space="preserve"> </w:t>
+      </w:r>
+      <w:proofErr w:type="spellStart"/>
+      <w:r>
+        <w:t>not</w:t>
+      </w:r>
+      <w:proofErr w:type="spellEnd"/>
+      <w:r>
+        <w:t xml:space="preserve"> </w:t>
+      </w:r>
+      <w:proofErr w:type="spellStart"/>
+      <w:r>
+        <w:t>None</w:t>
+      </w:r>
+      <w:proofErr w:type="spellEnd"/>
+      <w:r>
+        <w:t>:</w:t>
+      </w:r>
+    </w:p>
+    <w:p>
+      <w:pPr>
+        <w:spacing w:after="120"/>
+      </w:pPr>
+      <w:r>
+        <w:t xml:space="preserve">            </w:t>
+      </w:r>
+      <w:proofErr w:type="spellStart"/>
+      <w:proofErr w:type="gramStart"/>
+      <w:r>
+        <w:t>r.append</w:t>
+      </w:r>
+      <w:proofErr w:type="spellEnd"/>
+      <w:proofErr w:type="gramEnd"/>
+      <w:r>
+        <w:t>(</w:t>
+      </w:r>
+      <w:proofErr w:type="spellStart"/>
+      <w:r>
+        <w:t>actual.turno</w:t>
+      </w:r>
+      <w:proofErr w:type="spellEnd"/>
+      <w:r>
+        <w:t>)</w:t>
+      </w:r>
+    </w:p>
+    <w:p>
+      <w:pPr>
+        <w:spacing w:after="120"/>
+      </w:pPr>
+      <w:r>
+        <w:t xml:space="preserve">            actual = </w:t>
+      </w:r>
+      <w:proofErr w:type="spellStart"/>
+      <w:proofErr w:type="gramStart"/>
+      <w:r>
+        <w:t>actual.siguiente</w:t>
+      </w:r>
+      <w:proofErr w:type="spellEnd"/>
+      <w:proofErr w:type="gramEnd"/>
+    </w:p>
+    <w:p>
+      <w:pPr>
+        <w:spacing w:after="120"/>
+      </w:pPr>
+      <w:r>
+        <w:t xml:space="preserve">        </w:t>
+      </w:r>
+      <w:proofErr w:type="spellStart"/>
+      <w:r>
+        <w:t>return</w:t>
+      </w:r>
+      <w:proofErr w:type="spellEnd"/>
+      <w:r>
+        <w:t xml:space="preserve"> r</w:t>
+      </w:r>
+    </w:p>
+    <w:p>
+      <w:pPr>
+        <w:spacing w:after="120"/>
+      </w:pPr>
+    </w:p>
+    <w:p>
+      <w:pPr>
+        <w:spacing w:after="120"/>
+      </w:pPr>
     </w:p>
     <w:p>
       <w:pPr>
@@ -7601,6 +9434,7 @@
         <w:spacing w:after="300"/>
       </w:pPr>
       <w:r>
+        <w:lastRenderedPageBreak/>
         <w:t xml:space="preserve"> </w:t>
       </w:r>
     </w:p>
@@ -7695,12 +9529,6 @@
         <w:gridCol w:w="1700"/>
       </w:tblGrid>
       <w:tr>
-        <w:tblPrEx>
-          <w:tblCellMar>
-            <w:top w:w="0" w:type="dxa"/>
-            <w:bottom w:w="0" w:type="dxa"/>
-          </w:tblCellMar>
-        </w:tblPrEx>
         <w:trPr>
           <w:tblHeader/>
         </w:trPr>
@@ -7874,12 +9702,6 @@
         </w:tc>
       </w:tr>
       <w:tr>
-        <w:tblPrEx>
-          <w:tblCellMar>
-            <w:top w:w="0" w:type="dxa"/>
-            <w:bottom w:w="0" w:type="dxa"/>
-          </w:tblCellMar>
-        </w:tblPrEx>
         <w:tc>
           <w:tcPr>
             <w:tcW w:w="1200" w:type="dxa"/>
@@ -8005,12 +9827,6 @@
         </w:tc>
       </w:tr>
       <w:tr>
-        <w:tblPrEx>
-          <w:tblCellMar>
-            <w:top w:w="0" w:type="dxa"/>
-            <w:bottom w:w="0" w:type="dxa"/>
-          </w:tblCellMar>
-        </w:tblPrEx>
         <w:tc>
           <w:tcPr>
             <w:tcW w:w="1200" w:type="dxa"/>
@@ -8135,12 +9951,6 @@
         </w:tc>
       </w:tr>
       <w:tr>
-        <w:tblPrEx>
-          <w:tblCellMar>
-            <w:top w:w="0" w:type="dxa"/>
-            <w:bottom w:w="0" w:type="dxa"/>
-          </w:tblCellMar>
-        </w:tblPrEx>
         <w:tc>
           <w:tcPr>
             <w:tcW w:w="1200" w:type="dxa"/>
@@ -8259,12 +10069,6 @@
         </w:tc>
       </w:tr>
       <w:tr>
-        <w:tblPrEx>
-          <w:tblCellMar>
-            <w:top w:w="0" w:type="dxa"/>
-            <w:bottom w:w="0" w:type="dxa"/>
-          </w:tblCellMar>
-        </w:tblPrEx>
         <w:tc>
           <w:tcPr>
             <w:tcW w:w="1200" w:type="dxa"/>
@@ -8389,12 +10193,6 @@
         </w:tc>
       </w:tr>
       <w:tr>
-        <w:tblPrEx>
-          <w:tblCellMar>
-            <w:top w:w="0" w:type="dxa"/>
-            <w:bottom w:w="0" w:type="dxa"/>
-          </w:tblCellMar>
-        </w:tblPrEx>
         <w:tc>
           <w:tcPr>
             <w:tcW w:w="1200" w:type="dxa"/>
@@ -8653,7 +10451,7 @@
 </file>
 
 <file path=word/endnotes.xml><?xml version="1.0" encoding="utf-8"?>
-<w:endnotes xmlns:wpc="http://schemas.microsoft.com/office/word/2010/wordprocessingCanvas" xmlns:cx="http://schemas.microsoft.com/office/drawing/2014/chartex" xmlns:cx1="http://schemas.microsoft.com/office/drawing/2015/9/8/chartex" xmlns:cx2="http://schemas.microsoft.com/office/drawing/2015/10/21/chartex" xmlns:cx3="http://schemas.microsoft.com/office/drawing/2016/5/9/chartex" xmlns:cx4="http://schemas.microsoft.com/office/drawing/2016/5/10/chartex" xmlns:cx5="http://schemas.microsoft.com/office/drawing/2016/5/11/chartex" xmlns:cx6="http://schemas.microsoft.com/office/drawing/2016/5/12/chartex" xmlns:cx7="http://schemas.microsoft.com/office/drawing/2016/5/13/chartex" xmlns:cx8="http://schemas.microsoft.com/office/drawing/2016/5/14/chartex" xmlns:mc="http://schemas.openxmlformats.org/markup-compatibility/2006" xmlns:aink="http://schemas.microsoft.com/office/drawing/2016/ink" xmlns:am3d="http://schemas.microsoft.com/office/drawing/2017/model3d" xmlns:o="urn:schemas-microsoft-com:office:office" xmlns:oel="http://schemas.microsoft.com/office/2019/extlst" xmlns:r="http://schemas.openxmlformats.org/officeDocument/2006/relationships" xmlns:m="http://schemas.openxmlformats.org/officeDocument/2006/math" xmlns:v="urn:schemas-microsoft-com:vml" xmlns:wp14="http://schemas.microsoft.com/office/word/2010/wordprocessingDrawing" xmlns:wp="http://schemas.openxmlformats.org/drawingml/2006/wordprocessingDrawing" xmlns:w10="urn:schemas-microsoft-com:office:word" xmlns:w="http://schemas.openxmlformats.org/wordprocessingml/2006/main" xmlns:w14="http://schemas.microsoft.com/office/word/2010/wordml" xmlns:w15="http://schemas.microsoft.com/office/word/2012/wordml" xmlns:w16cex="http://schemas.microsoft.com/office/word/2018/wordml/cex" xmlns:w16cid="http://schemas.microsoft.com/office/word/2016/wordml/cid" xmlns:w16="http://schemas.microsoft.com/office/word/2018/wordml" xmlns:w16du="http://schemas.microsoft.com/office/word/2023/wordml/word16du" xmlns:w16sdtdh="http://schemas.microsoft.com/office/word/2020/wordml/sdtdatahash" xmlns:w16sdtfl="http://schemas.microsoft.com/office/word/2024/wordml/sdtformatlock" xmlns:w16se="http://schemas.microsoft.com/office/word/2015/wordml/symex" xmlns:wpg="http://schemas.microsoft.com/office/word/2010/wordprocessingGroup" xmlns:wpi="http://schemas.microsoft.com/office/word/2010/wordprocessingInk" xmlns:wne="http://schemas.microsoft.com/office/word/2006/wordml" xmlns:wps="http://schemas.microsoft.com/office/word/2010/wordprocessingShape" mc:Ignorable="w14 w15 w16se w16cid w16 w16cex w16sdtdh w16sdtfl w16du wp14">
+<w:endnotes xmlns:wpc="http://schemas.microsoft.com/office/word/2010/wordprocessingCanvas" xmlns:cx="http://schemas.microsoft.com/office/drawing/2014/chartex" xmlns:cx1="http://schemas.microsoft.com/office/drawing/2015/9/8/chartex" xmlns:cx2="http://schemas.microsoft.com/office/drawing/2015/10/21/chartex" xmlns:cx3="http://schemas.microsoft.com/office/drawing/2016/5/9/chartex" xmlns:cx4="http://schemas.microsoft.com/office/drawing/2016/5/10/chartex" xmlns:cx5="http://schemas.microsoft.com/office/drawing/2016/5/11/chartex" xmlns:cx6="http://schemas.microsoft.com/office/drawing/2016/5/12/chartex" xmlns:cx7="http://schemas.microsoft.com/office/drawing/2016/5/13/chartex" xmlns:cx8="http://schemas.microsoft.com/office/drawing/2016/5/14/chartex" xmlns:mc="http://schemas.openxmlformats.org/markup-compatibility/2006" xmlns:aink="http://schemas.microsoft.com/office/drawing/2016/ink" xmlns:am3d="http://schemas.microsoft.com/office/drawing/2017/model3d" xmlns:o="urn:schemas-microsoft-com:office:office" xmlns:oel="http://schemas.microsoft.com/office/2019/extlst" xmlns:r="http://schemas.openxmlformats.org/officeDocument/2006/relationships" xmlns:m="http://schemas.openxmlformats.org/officeDocument/2006/math" xmlns:v="urn:schemas-microsoft-com:vml" xmlns:wp14="http://schemas.microsoft.com/office/word/2010/wordprocessingDrawing" xmlns:wp="http://schemas.openxmlformats.org/drawingml/2006/wordprocessingDrawing" xmlns:w10="urn:schemas-microsoft-com:office:word" xmlns:w="http://schemas.openxmlformats.org/wordprocessingml/2006/main" xmlns:w14="http://schemas.microsoft.com/office/word/2010/wordml" xmlns:w15="http://schemas.microsoft.com/office/word/2012/wordml" xmlns:w16cex="http://schemas.microsoft.com/office/word/2018/wordml/cex" xmlns:w16cid="http://schemas.microsoft.com/office/word/2016/wordml/cid" xmlns:w16="http://schemas.microsoft.com/office/word/2018/wordml" xmlns:w16sdtdh="http://schemas.microsoft.com/office/word/2020/wordml/sdtdatahash" xmlns:w16se="http://schemas.microsoft.com/office/word/2015/wordml/symex" xmlns:wpg="http://schemas.microsoft.com/office/word/2010/wordprocessingGroup" xmlns:wpi="http://schemas.microsoft.com/office/word/2010/wordprocessingInk" xmlns:wne="http://schemas.microsoft.com/office/word/2006/wordml" xmlns:wps="http://schemas.microsoft.com/office/word/2010/wordprocessingShape" mc:Ignorable="w14 w15 w16se w16cid w16 w16cex w16sdtdh wp14">
   <w:endnote w:type="separator" w:id="-1">
     <w:p>
       <w:r>
@@ -8672,7 +10470,7 @@
 </file>
 
 <file path=word/footer1.xml><?xml version="1.0" encoding="utf-8"?>
-<w:ftr xmlns:wpc="http://schemas.microsoft.com/office/word/2010/wordprocessingCanvas" xmlns:cx="http://schemas.microsoft.com/office/drawing/2014/chartex" xmlns:cx1="http://schemas.microsoft.com/office/drawing/2015/9/8/chartex" xmlns:cx2="http://schemas.microsoft.com/office/drawing/2015/10/21/chartex" xmlns:cx3="http://schemas.microsoft.com/office/drawing/2016/5/9/chartex" xmlns:cx4="http://schemas.microsoft.com/office/drawing/2016/5/10/chartex" xmlns:cx5="http://schemas.microsoft.com/office/drawing/2016/5/11/chartex" xmlns:cx6="http://schemas.microsoft.com/office/drawing/2016/5/12/chartex" xmlns:cx7="http://schemas.microsoft.com/office/drawing/2016/5/13/chartex" xmlns:cx8="http://schemas.microsoft.com/office/drawing/2016/5/14/chartex" xmlns:mc="http://schemas.openxmlformats.org/markup-compatibility/2006" xmlns:aink="http://schemas.microsoft.com/office/drawing/2016/ink" xmlns:am3d="http://schemas.microsoft.com/office/drawing/2017/model3d" xmlns:o="urn:schemas-microsoft-com:office:office" xmlns:oel="http://schemas.microsoft.com/office/2019/extlst" xmlns:r="http://schemas.openxmlformats.org/officeDocument/2006/relationships" xmlns:m="http://schemas.openxmlformats.org/officeDocument/2006/math" xmlns:v="urn:schemas-microsoft-com:vml" xmlns:wp14="http://schemas.microsoft.com/office/word/2010/wordprocessingDrawing" xmlns:wp="http://schemas.openxmlformats.org/drawingml/2006/wordprocessingDrawing" xmlns:w10="urn:schemas-microsoft-com:office:word" xmlns:w="http://schemas.openxmlformats.org/wordprocessingml/2006/main" xmlns:w14="http://schemas.microsoft.com/office/word/2010/wordml" xmlns:w15="http://schemas.microsoft.com/office/word/2012/wordml" xmlns:w16cex="http://schemas.microsoft.com/office/word/2018/wordml/cex" xmlns:w16cid="http://schemas.microsoft.com/office/word/2016/wordml/cid" xmlns:w16="http://schemas.microsoft.com/office/word/2018/wordml" xmlns:w16du="http://schemas.microsoft.com/office/word/2023/wordml/word16du" xmlns:w16sdtdh="http://schemas.microsoft.com/office/word/2020/wordml/sdtdatahash" xmlns:w16sdtfl="http://schemas.microsoft.com/office/word/2024/wordml/sdtformatlock" xmlns:w16se="http://schemas.microsoft.com/office/word/2015/wordml/symex" xmlns:wpg="http://schemas.microsoft.com/office/word/2010/wordprocessingGroup" xmlns:wpi="http://schemas.microsoft.com/office/word/2010/wordprocessingInk" xmlns:wne="http://schemas.microsoft.com/office/word/2006/wordml" xmlns:wps="http://schemas.microsoft.com/office/word/2010/wordprocessingShape" mc:Ignorable="w14 w15 w16se w16cid w16 w16cex w16sdtdh w16sdtfl w16du wp14">
+<w:ftr xmlns:wpc="http://schemas.microsoft.com/office/word/2010/wordprocessingCanvas" xmlns:cx="http://schemas.microsoft.com/office/drawing/2014/chartex" xmlns:cx1="http://schemas.microsoft.com/office/drawing/2015/9/8/chartex" xmlns:cx2="http://schemas.microsoft.com/office/drawing/2015/10/21/chartex" xmlns:cx3="http://schemas.microsoft.com/office/drawing/2016/5/9/chartex" xmlns:cx4="http://schemas.microsoft.com/office/drawing/2016/5/10/chartex" xmlns:cx5="http://schemas.microsoft.com/office/drawing/2016/5/11/chartex" xmlns:cx6="http://schemas.microsoft.com/office/drawing/2016/5/12/chartex" xmlns:cx7="http://schemas.microsoft.com/office/drawing/2016/5/13/chartex" xmlns:cx8="http://schemas.microsoft.com/office/drawing/2016/5/14/chartex" xmlns:mc="http://schemas.openxmlformats.org/markup-compatibility/2006" xmlns:aink="http://schemas.microsoft.com/office/drawing/2016/ink" xmlns:am3d="http://schemas.microsoft.com/office/drawing/2017/model3d" xmlns:o="urn:schemas-microsoft-com:office:office" xmlns:oel="http://schemas.microsoft.com/office/2019/extlst" xmlns:r="http://schemas.openxmlformats.org/officeDocument/2006/relationships" xmlns:m="http://schemas.openxmlformats.org/officeDocument/2006/math" xmlns:v="urn:schemas-microsoft-com:vml" xmlns:wp14="http://schemas.microsoft.com/office/word/2010/wordprocessingDrawing" xmlns:wp="http://schemas.openxmlformats.org/drawingml/2006/wordprocessingDrawing" xmlns:w10="urn:schemas-microsoft-com:office:word" xmlns:w="http://schemas.openxmlformats.org/wordprocessingml/2006/main" xmlns:w14="http://schemas.microsoft.com/office/word/2010/wordml" xmlns:w15="http://schemas.microsoft.com/office/word/2012/wordml" xmlns:w16cex="http://schemas.microsoft.com/office/word/2018/wordml/cex" xmlns:w16cid="http://schemas.microsoft.com/office/word/2016/wordml/cid" xmlns:w16="http://schemas.microsoft.com/office/word/2018/wordml" xmlns:w16sdtdh="http://schemas.microsoft.com/office/word/2020/wordml/sdtdatahash" xmlns:w16se="http://schemas.microsoft.com/office/word/2015/wordml/symex" xmlns:wpg="http://schemas.microsoft.com/office/word/2010/wordprocessingGroup" xmlns:wpi="http://schemas.microsoft.com/office/word/2010/wordprocessingInk" xmlns:wne="http://schemas.microsoft.com/office/word/2006/wordml" xmlns:wps="http://schemas.microsoft.com/office/word/2010/wordprocessingShape" mc:Ignorable="w14 w15 w16se w16cid w16 w16cex w16sdtdh wp14">
   <w:p>
     <w:pPr>
       <w:jc w:val="center"/>
@@ -8780,7 +10578,7 @@
 </file>
 
 <file path=word/footnotes.xml><?xml version="1.0" encoding="utf-8"?>
-<w:footnotes xmlns:wpc="http://schemas.microsoft.com/office/word/2010/wordprocessingCanvas" xmlns:cx="http://schemas.microsoft.com/office/drawing/2014/chartex" xmlns:cx1="http://schemas.microsoft.com/office/drawing/2015/9/8/chartex" xmlns:cx2="http://schemas.microsoft.com/office/drawing/2015/10/21/chartex" xmlns:cx3="http://schemas.microsoft.com/office/drawing/2016/5/9/chartex" xmlns:cx4="http://schemas.microsoft.com/office/drawing/2016/5/10/chartex" xmlns:cx5="http://schemas.microsoft.com/office/drawing/2016/5/11/chartex" xmlns:cx6="http://schemas.microsoft.com/office/drawing/2016/5/12/chartex" xmlns:cx7="http://schemas.microsoft.com/office/drawing/2016/5/13/chartex" xmlns:cx8="http://schemas.microsoft.com/office/drawing/2016/5/14/chartex" xmlns:mc="http://schemas.openxmlformats.org/markup-compatibility/2006" xmlns:aink="http://schemas.microsoft.com/office/drawing/2016/ink" xmlns:am3d="http://schemas.microsoft.com/office/drawing/2017/model3d" xmlns:o="urn:schemas-microsoft-com:office:office" xmlns:oel="http://schemas.microsoft.com/office/2019/extlst" xmlns:r="http://schemas.openxmlformats.org/officeDocument/2006/relationships" xmlns:m="http://schemas.openxmlformats.org/officeDocument/2006/math" xmlns:v="urn:schemas-microsoft-com:vml" xmlns:wp14="http://schemas.microsoft.com/office/word/2010/wordprocessingDrawing" xmlns:wp="http://schemas.openxmlformats.org/drawingml/2006/wordprocessingDrawing" xmlns:w10="urn:schemas-microsoft-com:office:word" xmlns:w="http://schemas.openxmlformats.org/wordprocessingml/2006/main" xmlns:w14="http://schemas.microsoft.com/office/word/2010/wordml" xmlns:w15="http://schemas.microsoft.com/office/word/2012/wordml" xmlns:w16cex="http://schemas.microsoft.com/office/word/2018/wordml/cex" xmlns:w16cid="http://schemas.microsoft.com/office/word/2016/wordml/cid" xmlns:w16="http://schemas.microsoft.com/office/word/2018/wordml" xmlns:w16du="http://schemas.microsoft.com/office/word/2023/wordml/word16du" xmlns:w16sdtdh="http://schemas.microsoft.com/office/word/2020/wordml/sdtdatahash" xmlns:w16sdtfl="http://schemas.microsoft.com/office/word/2024/wordml/sdtformatlock" xmlns:w16se="http://schemas.microsoft.com/office/word/2015/wordml/symex" xmlns:wpg="http://schemas.microsoft.com/office/word/2010/wordprocessingGroup" xmlns:wpi="http://schemas.microsoft.com/office/word/2010/wordprocessingInk" xmlns:wne="http://schemas.microsoft.com/office/word/2006/wordml" xmlns:wps="http://schemas.microsoft.com/office/word/2010/wordprocessingShape" mc:Ignorable="w14 w15 w16se w16cid w16 w16cex w16sdtdh w16sdtfl w16du wp14">
+<w:footnotes xmlns:wpc="http://schemas.microsoft.com/office/word/2010/wordprocessingCanvas" xmlns:cx="http://schemas.microsoft.com/office/drawing/2014/chartex" xmlns:cx1="http://schemas.microsoft.com/office/drawing/2015/9/8/chartex" xmlns:cx2="http://schemas.microsoft.com/office/drawing/2015/10/21/chartex" xmlns:cx3="http://schemas.microsoft.com/office/drawing/2016/5/9/chartex" xmlns:cx4="http://schemas.microsoft.com/office/drawing/2016/5/10/chartex" xmlns:cx5="http://schemas.microsoft.com/office/drawing/2016/5/11/chartex" xmlns:cx6="http://schemas.microsoft.com/office/drawing/2016/5/12/chartex" xmlns:cx7="http://schemas.microsoft.com/office/drawing/2016/5/13/chartex" xmlns:cx8="http://schemas.microsoft.com/office/drawing/2016/5/14/chartex" xmlns:mc="http://schemas.openxmlformats.org/markup-compatibility/2006" xmlns:aink="http://schemas.microsoft.com/office/drawing/2016/ink" xmlns:am3d="http://schemas.microsoft.com/office/drawing/2017/model3d" xmlns:o="urn:schemas-microsoft-com:office:office" xmlns:oel="http://schemas.microsoft.com/office/2019/extlst" xmlns:r="http://schemas.openxmlformats.org/officeDocument/2006/relationships" xmlns:m="http://schemas.openxmlformats.org/officeDocument/2006/math" xmlns:v="urn:schemas-microsoft-com:vml" xmlns:wp14="http://schemas.microsoft.com/office/word/2010/wordprocessingDrawing" xmlns:wp="http://schemas.openxmlformats.org/drawingml/2006/wordprocessingDrawing" xmlns:w10="urn:schemas-microsoft-com:office:word" xmlns:w="http://schemas.openxmlformats.org/wordprocessingml/2006/main" xmlns:w14="http://schemas.microsoft.com/office/word/2010/wordml" xmlns:w15="http://schemas.microsoft.com/office/word/2012/wordml" xmlns:w16cex="http://schemas.microsoft.com/office/word/2018/wordml/cex" xmlns:w16cid="http://schemas.microsoft.com/office/word/2016/wordml/cid" xmlns:w16="http://schemas.microsoft.com/office/word/2018/wordml" xmlns:w16sdtdh="http://schemas.microsoft.com/office/word/2020/wordml/sdtdatahash" xmlns:w16se="http://schemas.microsoft.com/office/word/2015/wordml/symex" xmlns:wpg="http://schemas.microsoft.com/office/word/2010/wordprocessingGroup" xmlns:wpi="http://schemas.microsoft.com/office/word/2010/wordprocessingInk" xmlns:wne="http://schemas.microsoft.com/office/word/2006/wordml" xmlns:wps="http://schemas.microsoft.com/office/word/2010/wordprocessingShape" mc:Ignorable="w14 w15 w16se w16cid w16 w16cex w16sdtdh wp14">
   <w:footnote w:type="separator" w:id="-1">
     <w:p>
       <w:r>
@@ -8799,7 +10597,7 @@
 </file>
 
 <file path=word/header1.xml><?xml version="1.0" encoding="utf-8"?>
-<w:hdr xmlns:wpc="http://schemas.microsoft.com/office/word/2010/wordprocessingCanvas" xmlns:cx="http://schemas.microsoft.com/office/drawing/2014/chartex" xmlns:cx1="http://schemas.microsoft.com/office/drawing/2015/9/8/chartex" xmlns:cx2="http://schemas.microsoft.com/office/drawing/2015/10/21/chartex" xmlns:cx3="http://schemas.microsoft.com/office/drawing/2016/5/9/chartex" xmlns:cx4="http://schemas.microsoft.com/office/drawing/2016/5/10/chartex" xmlns:cx5="http://schemas.microsoft.com/office/drawing/2016/5/11/chartex" xmlns:cx6="http://schemas.microsoft.com/office/drawing/2016/5/12/chartex" xmlns:cx7="http://schemas.microsoft.com/office/drawing/2016/5/13/chartex" xmlns:cx8="http://schemas.microsoft.com/office/drawing/2016/5/14/chartex" xmlns:mc="http://schemas.openxmlformats.org/markup-compatibility/2006" xmlns:aink="http://schemas.microsoft.com/office/drawing/2016/ink" xmlns:am3d="http://schemas.microsoft.com/office/drawing/2017/model3d" xmlns:o="urn:schemas-microsoft-com:office:office" xmlns:oel="http://schemas.microsoft.com/office/2019/extlst" xmlns:r="http://schemas.openxmlformats.org/officeDocument/2006/relationships" xmlns:m="http://schemas.openxmlformats.org/officeDocument/2006/math" xmlns:v="urn:schemas-microsoft-com:vml" xmlns:wp14="http://schemas.microsoft.com/office/word/2010/wordprocessingDrawing" xmlns:wp="http://schemas.openxmlformats.org/drawingml/2006/wordprocessingDrawing" xmlns:w10="urn:schemas-microsoft-com:office:word" xmlns:w="http://schemas.openxmlformats.org/wordprocessingml/2006/main" xmlns:w14="http://schemas.microsoft.com/office/word/2010/wordml" xmlns:w15="http://schemas.microsoft.com/office/word/2012/wordml" xmlns:w16cex="http://schemas.microsoft.com/office/word/2018/wordml/cex" xmlns:w16cid="http://schemas.microsoft.com/office/word/2016/wordml/cid" xmlns:w16="http://schemas.microsoft.com/office/word/2018/wordml" xmlns:w16du="http://schemas.microsoft.com/office/word/2023/wordml/word16du" xmlns:w16sdtdh="http://schemas.microsoft.com/office/word/2020/wordml/sdtdatahash" xmlns:w16sdtfl="http://schemas.microsoft.com/office/word/2024/wordml/sdtformatlock" xmlns:w16se="http://schemas.microsoft.com/office/word/2015/wordml/symex" xmlns:wpg="http://schemas.microsoft.com/office/word/2010/wordprocessingGroup" xmlns:wpi="http://schemas.microsoft.com/office/word/2010/wordprocessingInk" xmlns:wne="http://schemas.microsoft.com/office/word/2006/wordml" xmlns:wps="http://schemas.microsoft.com/office/word/2010/wordprocessingShape" mc:Ignorable="w14 w15 w16se w16cid w16 w16cex w16sdtdh w16sdtfl w16du wp14">
+<w:hdr xmlns:wpc="http://schemas.microsoft.com/office/word/2010/wordprocessingCanvas" xmlns:cx="http://schemas.microsoft.com/office/drawing/2014/chartex" xmlns:cx1="http://schemas.microsoft.com/office/drawing/2015/9/8/chartex" xmlns:cx2="http://schemas.microsoft.com/office/drawing/2015/10/21/chartex" xmlns:cx3="http://schemas.microsoft.com/office/drawing/2016/5/9/chartex" xmlns:cx4="http://schemas.microsoft.com/office/drawing/2016/5/10/chartex" xmlns:cx5="http://schemas.microsoft.com/office/drawing/2016/5/11/chartex" xmlns:cx6="http://schemas.microsoft.com/office/drawing/2016/5/12/chartex" xmlns:cx7="http://schemas.microsoft.com/office/drawing/2016/5/13/chartex" xmlns:cx8="http://schemas.microsoft.com/office/drawing/2016/5/14/chartex" xmlns:mc="http://schemas.openxmlformats.org/markup-compatibility/2006" xmlns:aink="http://schemas.microsoft.com/office/drawing/2016/ink" xmlns:am3d="http://schemas.microsoft.com/office/drawing/2017/model3d" xmlns:o="urn:schemas-microsoft-com:office:office" xmlns:oel="http://schemas.microsoft.com/office/2019/extlst" xmlns:r="http://schemas.openxmlformats.org/officeDocument/2006/relationships" xmlns:m="http://schemas.openxmlformats.org/officeDocument/2006/math" xmlns:v="urn:schemas-microsoft-com:vml" xmlns:wp14="http://schemas.microsoft.com/office/word/2010/wordprocessingDrawing" xmlns:wp="http://schemas.openxmlformats.org/drawingml/2006/wordprocessingDrawing" xmlns:w10="urn:schemas-microsoft-com:office:word" xmlns:w="http://schemas.openxmlformats.org/wordprocessingml/2006/main" xmlns:w14="http://schemas.microsoft.com/office/word/2010/wordml" xmlns:w15="http://schemas.microsoft.com/office/word/2012/wordml" xmlns:w16cex="http://schemas.microsoft.com/office/word/2018/wordml/cex" xmlns:w16cid="http://schemas.microsoft.com/office/word/2016/wordml/cid" xmlns:w16="http://schemas.microsoft.com/office/word/2018/wordml" xmlns:w16sdtdh="http://schemas.microsoft.com/office/word/2020/wordml/sdtdatahash" xmlns:w16se="http://schemas.microsoft.com/office/word/2015/wordml/symex" xmlns:wpg="http://schemas.microsoft.com/office/word/2010/wordprocessingGroup" xmlns:wpi="http://schemas.microsoft.com/office/word/2010/wordprocessingInk" xmlns:wne="http://schemas.microsoft.com/office/word/2006/wordml" xmlns:wps="http://schemas.microsoft.com/office/word/2010/wordprocessingShape" mc:Ignorable="w14 w15 w16se w16cid w16 w16cex w16sdtdh wp14">
   <w:p>
     <w:pPr>
       <w:pBdr>
@@ -8822,7 +10620,7 @@
 </file>
 
 <file path=word/numbering.xml><?xml version="1.0" encoding="utf-8"?>
-<w:numbering xmlns:wpc="http://schemas.microsoft.com/office/word/2010/wordprocessingCanvas" xmlns:cx="http://schemas.microsoft.com/office/drawing/2014/chartex" xmlns:cx1="http://schemas.microsoft.com/office/drawing/2015/9/8/chartex" xmlns:cx2="http://schemas.microsoft.com/office/drawing/2015/10/21/chartex" xmlns:cx3="http://schemas.microsoft.com/office/drawing/2016/5/9/chartex" xmlns:cx4="http://schemas.microsoft.com/office/drawing/2016/5/10/chartex" xmlns:cx5="http://schemas.microsoft.com/office/drawing/2016/5/11/chartex" xmlns:cx6="http://schemas.microsoft.com/office/drawing/2016/5/12/chartex" xmlns:cx7="http://schemas.microsoft.com/office/drawing/2016/5/13/chartex" xmlns:cx8="http://schemas.microsoft.com/office/drawing/2016/5/14/chartex" xmlns:mc="http://schemas.openxmlformats.org/markup-compatibility/2006" xmlns:aink="http://schemas.microsoft.com/office/drawing/2016/ink" xmlns:am3d="http://schemas.microsoft.com/office/drawing/2017/model3d" xmlns:o="urn:schemas-microsoft-com:office:office" xmlns:oel="http://schemas.microsoft.com/office/2019/extlst" xmlns:r="http://schemas.openxmlformats.org/officeDocument/2006/relationships" xmlns:m="http://schemas.openxmlformats.org/officeDocument/2006/math" xmlns:v="urn:schemas-microsoft-com:vml" xmlns:wp14="http://schemas.microsoft.com/office/word/2010/wordprocessingDrawing" xmlns:wp="http://schemas.openxmlformats.org/drawingml/2006/wordprocessingDrawing" xmlns:w10="urn:schemas-microsoft-com:office:word" xmlns:w="http://schemas.openxmlformats.org/wordprocessingml/2006/main" xmlns:w14="http://schemas.microsoft.com/office/word/2010/wordml" xmlns:w15="http://schemas.microsoft.com/office/word/2012/wordml" xmlns:w16cex="http://schemas.microsoft.com/office/word/2018/wordml/cex" xmlns:w16cid="http://schemas.microsoft.com/office/word/2016/wordml/cid" xmlns:w16="http://schemas.microsoft.com/office/word/2018/wordml" xmlns:w16du="http://schemas.microsoft.com/office/word/2023/wordml/word16du" xmlns:w16sdtdh="http://schemas.microsoft.com/office/word/2020/wordml/sdtdatahash" xmlns:w16sdtfl="http://schemas.microsoft.com/office/word/2024/wordml/sdtformatlock" xmlns:w16se="http://schemas.microsoft.com/office/word/2015/wordml/symex" xmlns:wpg="http://schemas.microsoft.com/office/word/2010/wordprocessingGroup" xmlns:wpi="http://schemas.microsoft.com/office/word/2010/wordprocessingInk" xmlns:wne="http://schemas.microsoft.com/office/word/2006/wordml" xmlns:wps="http://schemas.microsoft.com/office/word/2010/wordprocessingShape" mc:Ignorable="w14 w15 w16se w16cid w16 w16cex w16sdtdh w16sdtfl w16du wp14">
+<w:numbering xmlns:wpc="http://schemas.microsoft.com/office/word/2010/wordprocessingCanvas" xmlns:cx="http://schemas.microsoft.com/office/drawing/2014/chartex" xmlns:cx1="http://schemas.microsoft.com/office/drawing/2015/9/8/chartex" xmlns:cx2="http://schemas.microsoft.com/office/drawing/2015/10/21/chartex" xmlns:cx3="http://schemas.microsoft.com/office/drawing/2016/5/9/chartex" xmlns:cx4="http://schemas.microsoft.com/office/drawing/2016/5/10/chartex" xmlns:cx5="http://schemas.microsoft.com/office/drawing/2016/5/11/chartex" xmlns:cx6="http://schemas.microsoft.com/office/drawing/2016/5/12/chartex" xmlns:cx7="http://schemas.microsoft.com/office/drawing/2016/5/13/chartex" xmlns:cx8="http://schemas.microsoft.com/office/drawing/2016/5/14/chartex" xmlns:mc="http://schemas.openxmlformats.org/markup-compatibility/2006" xmlns:aink="http://schemas.microsoft.com/office/drawing/2016/ink" xmlns:am3d="http://schemas.microsoft.com/office/drawing/2017/model3d" xmlns:o="urn:schemas-microsoft-com:office:office" xmlns:oel="http://schemas.microsoft.com/office/2019/extlst" xmlns:r="http://schemas.openxmlformats.org/officeDocument/2006/relationships" xmlns:m="http://schemas.openxmlformats.org/officeDocument/2006/math" xmlns:v="urn:schemas-microsoft-com:vml" xmlns:wp14="http://schemas.microsoft.com/office/word/2010/wordprocessingDrawing" xmlns:wp="http://schemas.openxmlformats.org/drawingml/2006/wordprocessingDrawing" xmlns:w10="urn:schemas-microsoft-com:office:word" xmlns:w="http://schemas.openxmlformats.org/wordprocessingml/2006/main" xmlns:w14="http://schemas.microsoft.com/office/word/2010/wordml" xmlns:w15="http://schemas.microsoft.com/office/word/2012/wordml" xmlns:w16cex="http://schemas.microsoft.com/office/word/2018/wordml/cex" xmlns:w16cid="http://schemas.microsoft.com/office/word/2016/wordml/cid" xmlns:w16="http://schemas.microsoft.com/office/word/2018/wordml" xmlns:w16sdtdh="http://schemas.microsoft.com/office/word/2020/wordml/sdtdatahash" xmlns:w16se="http://schemas.microsoft.com/office/word/2015/wordml/symex" xmlns:wpg="http://schemas.microsoft.com/office/word/2010/wordprocessingGroup" xmlns:wpi="http://schemas.microsoft.com/office/word/2010/wordprocessingInk" xmlns:wne="http://schemas.microsoft.com/office/word/2006/wordml" xmlns:wps="http://schemas.microsoft.com/office/word/2010/wordprocessingShape" mc:Ignorable="w14 w15 w16se w16cid w16 w16cex w16sdtdh wp14">
   <w:abstractNum w:abstractNumId="0" w15:restartNumberingAfterBreak="0">
     <w:nsid w:val="1A79388D"/>
     <w:multiLevelType w:val="hybridMultilevel"/>
@@ -9279,7 +11077,7 @@
 </file>
 
 <file path=word/styles.xml><?xml version="1.0" encoding="utf-8"?>
-<w:styles xmlns:mc="http://schemas.openxmlformats.org/markup-compatibility/2006" xmlns:r="http://schemas.openxmlformats.org/officeDocument/2006/relationships" xmlns:w="http://schemas.openxmlformats.org/wordprocessingml/2006/main" xmlns:w14="http://schemas.microsoft.com/office/word/2010/wordml" xmlns:w15="http://schemas.microsoft.com/office/word/2012/wordml" xmlns:w16cex="http://schemas.microsoft.com/office/word/2018/wordml/cex" xmlns:w16cid="http://schemas.microsoft.com/office/word/2016/wordml/cid" xmlns:w16="http://schemas.microsoft.com/office/word/2018/wordml" xmlns:w16du="http://schemas.microsoft.com/office/word/2023/wordml/word16du" xmlns:w16sdtdh="http://schemas.microsoft.com/office/word/2020/wordml/sdtdatahash" xmlns:w16sdtfl="http://schemas.microsoft.com/office/word/2024/wordml/sdtformatlock" xmlns:w16se="http://schemas.microsoft.com/office/word/2015/wordml/symex" mc:Ignorable="w14 w15 w16se w16cid w16 w16cex w16sdtdh w16sdtfl w16du">
+<w:styles xmlns:mc="http://schemas.openxmlformats.org/markup-compatibility/2006" xmlns:r="http://schemas.openxmlformats.org/officeDocument/2006/relationships" xmlns:w="http://schemas.openxmlformats.org/wordprocessingml/2006/main" xmlns:w14="http://schemas.microsoft.com/office/word/2010/wordml" xmlns:w15="http://schemas.microsoft.com/office/word/2012/wordml" xmlns:w16cex="http://schemas.microsoft.com/office/word/2018/wordml/cex" xmlns:w16cid="http://schemas.microsoft.com/office/word/2016/wordml/cid" xmlns:w16="http://schemas.microsoft.com/office/word/2018/wordml" xmlns:w16sdtdh="http://schemas.microsoft.com/office/word/2020/wordml/sdtdatahash" xmlns:w16se="http://schemas.microsoft.com/office/word/2015/wordml/symex" mc:Ignorable="w14 w15 w16se w16cid w16 w16cex w16sdtdh">
   <w:docDefaults>
     <w:rPrDefault>
       <w:rPr>

</xml_diff>